<commit_message>
docs(guides): non-elevated ADUC launch, single PODXX-DC connection, M2-L1 read-only
- AC/IA: replace plain dsa.msc with the RunAsInvoker fallback command and warn
  against Server Manager, PowerShell (Admin) and Run as administrator
- IA: M2-L1 step 2/3 stated as read-only and instructor-credited this cohort
- IA/SI/MP/PE: drop the PODXX-WS01 row; students only receive PODXX-DC
- SC: firewall named PODXX-GW only in the diagram, reached from a browser on
  PODXX-DC
- AC/SI: add the completion checklist to the table of contents
- build-guides.sh: use each guide's H1 as the PDF title
</commit_message>
<xml_diff>
--- a/docs/MP-Lab-Completion-Guide.docx
+++ b/docs/MP-Lab-Completion-Guide.docx
@@ -345,7 +345,7 @@
         <w:t xml:space="preserve">.vhdx</w:t>
       </w:r>
       <w:r>
-        <w:t xml:space="preserve">) that you mount on the domain controller exactly like a real thumb drive. You will inspect what is on the media, decide whether it contains FCI, sanitize media so it can be safely reused, and complete the paperwork (logs, certificates, worksheets) that an assessor would ask to see.</w:t>
+        <w:t xml:space="preserve">) in your pod folder, and a contents listing published next to it shows everything on that drive. You will inspect what is on the media, decide whether it contains FCI, sanitize media so it can be safely reused, and complete the paperwork (logs, certificates, worksheets) that an assessor would ask to see.</w:t>
       </w:r>
     </w:p>
     <w:p>
@@ -362,7 +362,7 @@
         <w:t xml:space="preserve"> </w:t>
       </w:r>
       <w:r>
-        <w:t xml:space="preserve">deleting files is not sanitization. Your work is checked by inspecting the media itself, not just your paperwork.</w:t>
+        <w:t xml:space="preserve">deleting files is not sanitization — media must be classified, sanitized by an approved method, and documented before it is reused or disposed of.</w:t>
       </w:r>
     </w:p>
     <w:p>
@@ -796,34 +796,15 @@
           </w:p>
         </w:tc>
       </w:tr>
-      <w:tr>
-        <w:tc>
-          <w:p>
-            <w:pPr>
-              <w:pStyle w:val="Compact"/>
-              <w:jc w:val="left"/>
-            </w:pPr>
-            <w:r>
-              <w:rPr>
-                <w:b/>
-              </w:rPr>
-              <w:t xml:space="preserve">PODXX-WS01</w:t>
-            </w:r>
-          </w:p>
-        </w:tc>
-        <w:tc>
-          <w:p>
-            <w:pPr>
-              <w:pStyle w:val="Compact"/>
-              <w:jc w:val="left"/>
-            </w:pPr>
-            <w:r>
-              <w:t xml:space="preserve">Workstation (used for other lab families)</w:t>
-            </w:r>
-          </w:p>
-        </w:tc>
-      </w:tr>
     </w:tbl>
+    <w:p>
+      <w:pPr>
+        <w:pStyle w:val="BodyText"/>
+      </w:pPr>
+      <w:r>
+        <w:t xml:space="preserve">This is the only connection you get: every MP lab is done on this desktop.</w:t>
+      </w:r>
+    </w:p>
     <w:p>
       <w:pPr>
         <w:numPr>
@@ -1314,6 +1295,45 @@
               <w:rPr>
                 <w:rStyle w:val="VerbatimChar"/>
               </w:rPr>
+              <w:t xml:space="preserve">PXX-FCI-USB-Contents.txt</w:t>
+            </w:r>
+            <w:r>
+              <w:t xml:space="preserve">,</w:t>
+            </w:r>
+            <w:r>
+              <w:t xml:space="preserve"> </w:t>
+            </w:r>
+            <w:r>
+              <w:rPr>
+                <w:rStyle w:val="VerbatimChar"/>
+              </w:rPr>
+              <w:t xml:space="preserve">PXX-Employee-Handbook-Contents.txt</w:t>
+            </w:r>
+          </w:p>
+        </w:tc>
+        <w:tc>
+          <w:p>
+            <w:pPr>
+              <w:pStyle w:val="Compact"/>
+              <w:jc w:val="left"/>
+            </w:pPr>
+            <w:r>
+              <w:t xml:space="preserve">Full contents listing of each drive, including hidden items — read these instead of mounting</w:t>
+            </w:r>
+          </w:p>
+        </w:tc>
+      </w:tr>
+      <w:tr>
+        <w:tc>
+          <w:p>
+            <w:pPr>
+              <w:pStyle w:val="Compact"/>
+              <w:jc w:val="left"/>
+            </w:pPr>
+            <w:r>
+              <w:rPr>
+                <w:rStyle w:val="VerbatimChar"/>
+              </w:rPr>
               <w:t xml:space="preserve">MediaInventory.xlsx</w:t>
             </w:r>
           </w:p>
@@ -1529,7 +1549,7 @@
               <w:t xml:space="preserve"> </w:t>
             </w:r>
             <w:r>
-              <w:t xml:space="preserve">edit or delete — used to verify the media was truly re-created</w:t>
+              <w:t xml:space="preserve">edit or delete</w:t>
             </w:r>
           </w:p>
         </w:tc>
@@ -2089,16 +2109,58 @@
         <w:t xml:space="preserve"> </w:t>
       </w:r>
       <w:r>
-        <w:t xml:space="preserve">file behaves like a physical USB drive once you mount it.</w:t>
+        <w:t xml:space="preserve">file behaves like a physical USB drive. Mounting one is an</w:t>
+      </w:r>
+      <w:r>
+        <w:t xml:space="preserve"> </w:t>
+      </w:r>
+      <w:r>
+        <w:t xml:space="preserve">administrator operation on Windows, and on this shared server student accounts</w:t>
+      </w:r>
+      <w:r>
+        <w:t xml:space="preserve"> </w:t>
+      </w:r>
+      <w:r>
+        <w:t xml:space="preserve">are deliberately not administrators — so for this cohort</w:t>
+      </w:r>
+      <w:r>
+        <w:t xml:space="preserve"> </w:t>
+      </w:r>
+      <w:r>
+        <w:rPr>
+          <w:b/>
+        </w:rPr>
+        <w:t xml:space="preserve">you do not mount the</w:t>
+      </w:r>
+      <w:r>
+        <w:rPr>
+          <w:b/>
+        </w:rPr>
+        <w:t xml:space="preserve"> </w:t>
+      </w:r>
+      <w:r>
+        <w:rPr>
+          <w:b/>
+        </w:rPr>
+        <w:t xml:space="preserve">media yourself</w:t>
+      </w:r>
+      <w:r>
+        <w:t xml:space="preserve">. Each drive image ships with a full contents listing that was</w:t>
+      </w:r>
+      <w:r>
+        <w:t xml:space="preserve"> </w:t>
+      </w:r>
+      <w:r>
+        <w:t xml:space="preserve">captured from the mounted media, and you classify and document from that.</w:t>
       </w:r>
     </w:p>
     <w:p>
       <w:pPr>
         <w:pStyle w:val="Heading3"/>
       </w:pPr>
-      <w:bookmarkStart w:id="38" w:name="mount-media-read-it"/>
-      <w:r>
-        <w:t xml:space="preserve">Mount media (read it)</w:t>
+      <w:bookmarkStart w:id="38" w:name="read-what-is-on-a-drive"/>
+      <w:r>
+        <w:t xml:space="preserve">Read what is on a drive</w:t>
       </w:r>
       <w:bookmarkEnd w:id="38"/>
     </w:p>
@@ -2132,43 +2194,37 @@
         <w:pStyle w:val="Compact"/>
       </w:pPr>
       <w:r>
-        <w:rPr>
-          <w:b/>
-        </w:rPr>
-        <w:t xml:space="preserve">Double-click</w:t>
-      </w:r>
-      <w:r>
-        <w:t xml:space="preserve"> </w:t>
-      </w:r>
-      <w:r>
-        <w:t xml:space="preserve">the</w:t>
-      </w:r>
-      <w:r>
-        <w:t xml:space="preserve"> </w:t>
-      </w:r>
-      <w:r>
-        <w:rPr>
-          <w:rStyle w:val="VerbatimChar"/>
-        </w:rPr>
-        <w:t xml:space="preserve">.vhdx</w:t>
-      </w:r>
-      <w:r>
-        <w:t xml:space="preserve"> </w:t>
-      </w:r>
-      <w:r>
-        <w:t xml:space="preserve">file (or right-click →</w:t>
-      </w:r>
-      <w:r>
-        <w:t xml:space="preserve"> </w:t>
-      </w:r>
-      <w:r>
-        <w:rPr>
-          <w:b/>
-        </w:rPr>
-        <w:t xml:space="preserve">Mount</w:t>
-      </w:r>
-      <w:r>
-        <w:t xml:space="preserve">)</w:t>
+        <w:t xml:space="preserve">Open the listing next to the drive image:</w:t>
+      </w:r>
+    </w:p>
+    <w:p>
+      <w:pPr>
+        <w:numPr>
+          <w:ilvl w:val="1"/>
+          <w:numId w:val="1013"/>
+        </w:numPr>
+        <w:pStyle w:val="Compact"/>
+      </w:pPr>
+      <w:r>
+        <w:rPr>
+          <w:rStyle w:val="VerbatimChar"/>
+        </w:rPr>
+        <w:t xml:space="preserve">PXX-FCI-USB-Contents.txt</w:t>
+      </w:r>
+    </w:p>
+    <w:p>
+      <w:pPr>
+        <w:numPr>
+          <w:ilvl w:val="1"/>
+          <w:numId w:val="1013"/>
+        </w:numPr>
+        <w:pStyle w:val="Compact"/>
+      </w:pPr>
+      <w:r>
+        <w:rPr>
+          <w:rStyle w:val="VerbatimChar"/>
+        </w:rPr>
+        <w:t xml:space="preserve">PXX-Employee-Handbook-Contents.txt</w:t>
       </w:r>
     </w:p>
     <w:p>
@@ -2180,74 +2236,35 @@
         <w:pStyle w:val="Compact"/>
       </w:pPr>
       <w:r>
-        <w:t xml:space="preserve">A new drive letter appears under</w:t>
-      </w:r>
-      <w:r>
-        <w:t xml:space="preserve"> </w:t>
-      </w:r>
-      <w:r>
-        <w:rPr>
-          <w:b/>
-        </w:rPr>
-        <w:t xml:space="preserve">This PC</w:t>
-      </w:r>
-      <w:r>
-        <w:t xml:space="preserve"> </w:t>
-      </w:r>
-      <w:r>
-        <w:t xml:space="preserve">— open it to browse the contents</w:t>
-      </w:r>
-    </w:p>
-    <w:p>
-      <w:pPr>
-        <w:pStyle w:val="Heading3"/>
-      </w:pPr>
-      <w:bookmarkStart w:id="39" w:name="Xd0d405ea46f316f7a804d0364901610cd9bf2ee"/>
-      <w:r>
-        <w:t xml:space="preserve">Show hidden files (you will need this in M1-L1)</w:t>
-      </w:r>
-      <w:bookmarkEnd w:id="39"/>
+        <w:t xml:space="preserve">Each listing shows the volume label and</w:t>
+      </w:r>
+      <w:r>
+        <w:t xml:space="preserve"> </w:t>
+      </w:r>
+      <w:r>
+        <w:rPr>
+          <w:b/>
+        </w:rPr>
+        <w:t xml:space="preserve">every</w:t>
+      </w:r>
+      <w:r>
+        <w:t xml:space="preserve"> </w:t>
+      </w:r>
+      <w:r>
+        <w:t xml:space="preserve">file and folder on that</w:t>
+      </w:r>
+      <w:r>
+        <w:t xml:space="preserve"> </w:t>
+      </w:r>
+      <w:r>
+        <w:t xml:space="preserve">drive — including hidden items — with sizes</w:t>
+      </w:r>
     </w:p>
     <w:p>
       <w:pPr>
         <w:pStyle w:val="FirstParagraph"/>
       </w:pPr>
       <w:r>
-        <w:t xml:space="preserve">In File Explorer:</w:t>
-      </w:r>
-      <w:r>
-        <w:t xml:space="preserve"> </w:t>
-      </w:r>
-      <w:r>
-        <w:rPr>
-          <w:b/>
-        </w:rPr>
-        <w:t xml:space="preserve">View</w:t>
-      </w:r>
-      <w:r>
-        <w:t xml:space="preserve"> </w:t>
-      </w:r>
-      <w:r>
-        <w:t xml:space="preserve">ribbon → check</w:t>
-      </w:r>
-      <w:r>
-        <w:t xml:space="preserve"> </w:t>
-      </w:r>
-      <w:r>
-        <w:rPr>
-          <w:b/>
-        </w:rPr>
-        <w:t xml:space="preserve">Hidden items</w:t>
-      </w:r>
-      <w:r>
-        <w:t xml:space="preserve">.</w:t>
-      </w:r>
-    </w:p>
-    <w:p>
-      <w:pPr>
-        <w:pStyle w:val="BodyText"/>
-      </w:pPr>
-      <w:r>
         <w:t xml:space="preserve">Or in PowerShell:</w:t>
       </w:r>
     </w:p>
@@ -2259,24 +2276,58 @@
         <w:rPr>
           <w:rStyle w:val="FunctionTok"/>
         </w:rPr>
-        <w:t xml:space="preserve">Get-ChildItem</w:t>
+        <w:t xml:space="preserve">Get-Content</w:t>
       </w:r>
       <w:r>
         <w:rPr>
           <w:rStyle w:val="NormalTok"/>
         </w:rPr>
-        <w:t xml:space="preserve"> -Path E:\ -Recurse -Force</w:t>
-      </w:r>
-    </w:p>
-    <w:p>
-      <w:pPr>
-        <w:pStyle w:val="FirstParagraph"/>
-      </w:pPr>
+        <w:t xml:space="preserve"> C:\CyberLab\PodXX\MP-Artifacts\PXX-FCI-USB-Contents.</w:t>
+      </w:r>
+      <w:r>
+        <w:rPr>
+          <w:rStyle w:val="FunctionTok"/>
+        </w:rPr>
+        <w:t xml:space="preserve">txt</w:t>
+      </w:r>
+    </w:p>
+    <w:p>
+      <w:pPr>
+        <w:pStyle w:val="BlockText"/>
+      </w:pPr>
+      <w:r>
+        <w:rPr>
+          <w:b/>
+        </w:rPr>
+        <w:t xml:space="preserve">If you try to mount a</w:t>
+      </w:r>
+      <w:r>
+        <w:rPr>
+          <w:b/>
+        </w:rPr>
+        <w:t xml:space="preserve"> </w:t>
+      </w:r>
+      <w:r>
+        <w:rPr>
+          <w:rStyle w:val="VerbatimChar"/>
+          <w:b/>
+        </w:rPr>
+        <w:t xml:space="preserve">.vhdx</w:t>
+      </w:r>
+      <w:r>
+        <w:t xml:space="preserve"> </w:t>
+      </w:r>
+      <w:r>
+        <w:t xml:space="preserve">you will get</w:t>
+      </w:r>
+      <w:r>
+        <w:t xml:space="preserve"> </w:t>
+      </w:r>
       <w:r>
         <w:rPr>
           <w:i/>
         </w:rPr>
-        <w:t xml:space="preserve">(Replace</w:t>
+        <w:t xml:space="preserve">"A required privilege is not</w:t>
       </w:r>
       <w:r>
         <w:rPr>
@@ -2286,109 +2337,24 @@
       </w:r>
       <w:r>
         <w:rPr>
-          <w:rStyle w:val="VerbatimChar"/>
           <w:i/>
         </w:rPr>
-        <w:t xml:space="preserve">E:\</w:t>
-      </w:r>
-      <w:r>
-        <w:rPr>
-          <w:i/>
-        </w:rPr>
-        <w:t xml:space="preserve"> </w:t>
-      </w:r>
-      <w:r>
-        <w:rPr>
-          <w:i/>
-        </w:rPr>
-        <w:t xml:space="preserve">with the drive letter that appeared when you mounted the media.)</w:t>
-      </w:r>
-    </w:p>
-    <w:p>
-      <w:pPr>
-        <w:pStyle w:val="Heading3"/>
-      </w:pPr>
-      <w:bookmarkStart w:id="40" w:name="eject-media"/>
-      <w:r>
-        <w:t xml:space="preserve">Eject media</w:t>
-      </w:r>
-      <w:bookmarkEnd w:id="40"/>
-    </w:p>
-    <w:p>
-      <w:pPr>
-        <w:pStyle w:val="FirstParagraph"/>
-      </w:pPr>
-      <w:r>
-        <w:t xml:space="preserve">Right-click the drive under</w:t>
-      </w:r>
-      <w:r>
-        <w:t xml:space="preserve"> </w:t>
-      </w:r>
-      <w:r>
-        <w:rPr>
-          <w:b/>
-        </w:rPr>
-        <w:t xml:space="preserve">This PC</w:t>
-      </w:r>
-      <w:r>
-        <w:t xml:space="preserve"> </w:t>
-      </w:r>
-      <w:r>
-        <w:t xml:space="preserve">→</w:t>
-      </w:r>
-      <w:r>
-        <w:t xml:space="preserve"> </w:t>
-      </w:r>
-      <w:r>
-        <w:rPr>
-          <w:b/>
-        </w:rPr>
-        <w:t xml:space="preserve">Eject</w:t>
-      </w:r>
-      <w:r>
-        <w:t xml:space="preserve">.</w:t>
-      </w:r>
-    </w:p>
-    <w:p>
-      <w:pPr>
-        <w:pStyle w:val="BodyText"/>
-      </w:pPr>
-      <w:r>
-        <w:t xml:space="preserve">Or in PowerShell:</w:t>
-      </w:r>
-    </w:p>
-    <w:p>
-      <w:pPr>
-        <w:pStyle w:val="SourceCode"/>
-      </w:pPr>
-      <w:r>
-        <w:rPr>
-          <w:rStyle w:val="NormalTok"/>
-        </w:rPr>
-        <w:t xml:space="preserve">Dismount-DiskImage -ImagePath </w:t>
-      </w:r>
-      <w:r>
-        <w:rPr>
-          <w:rStyle w:val="StringTok"/>
-        </w:rPr>
-        <w:t xml:space="preserve">"C:\CyberLab\PodXX\MP-Artifacts\PXX-FCI-USB.vhdx"</w:t>
-      </w:r>
-    </w:p>
-    <w:p>
-      <w:pPr>
-        <w:pStyle w:val="BlockText"/>
-      </w:pPr>
-      <w:r>
-        <w:rPr>
-          <w:b/>
-        </w:rPr>
-        <w:t xml:space="preserve">Tip:</w:t>
-      </w:r>
-      <w:r>
-        <w:t xml:space="preserve"> </w:t>
-      </w:r>
-      <w:r>
-        <w:t xml:space="preserve">Always eject media before moving on to the next lab so the checker can inspect it cleanly.</w:t>
+        <w:t xml:space="preserve">held by the client"</w:t>
+      </w:r>
+      <w:r>
+        <w:t xml:space="preserve">, or Windows will ask for administrator credentials that</w:t>
+      </w:r>
+      <w:r>
+        <w:t xml:space="preserve"> </w:t>
+      </w:r>
+      <w:r>
+        <w:t xml:space="preserve">your account does not have. That is expected — use the contents listing</w:t>
+      </w:r>
+      <w:r>
+        <w:t xml:space="preserve"> </w:t>
+      </w:r>
+      <w:r>
+        <w:t xml:space="preserve">instead. Nothing is broken and no lab credit depends on mounting.</w:t>
       </w:r>
     </w:p>
     <w:p>
@@ -2402,211 +2368,111 @@
       <w:pPr>
         <w:pStyle w:val="Heading2"/>
       </w:pPr>
-      <w:bookmarkStart w:id="41" w:name="module-1-media-protection"/>
+      <w:bookmarkStart w:id="39" w:name="module-1-media-protection"/>
       <w:r>
         <w:t xml:space="preserve">Module 1: Media Protection</w:t>
       </w:r>
+      <w:bookmarkEnd w:id="39"/>
+    </w:p>
+    <w:p>
+      <w:pPr>
+        <w:pStyle w:val="Heading3"/>
+      </w:pPr>
+      <w:bookmarkStart w:id="40" w:name="lab-m1-l1-classify-the-media"/>
+      <w:r>
+        <w:t xml:space="preserve">Lab M1-L1: Classify the Media</w:t>
+      </w:r>
+      <w:bookmarkEnd w:id="40"/>
+    </w:p>
+    <w:p>
+      <w:pPr>
+        <w:pStyle w:val="FirstParagraph"/>
+      </w:pPr>
+      <w:r>
+        <w:rPr>
+          <w:b/>
+        </w:rPr>
+        <w:t xml:space="preserve">Difficulty:</w:t>
+      </w:r>
+      <w:r>
+        <w:t xml:space="preserve"> </w:t>
+      </w:r>
+      <w:r>
+        <w:t xml:space="preserve">Beginner |</w:t>
+      </w:r>
+      <w:r>
+        <w:t xml:space="preserve"> </w:t>
+      </w:r>
+      <w:r>
+        <w:rPr>
+          <w:b/>
+        </w:rPr>
+        <w:t xml:space="preserve">Time:</w:t>
+      </w:r>
+      <w:r>
+        <w:t xml:space="preserve"> </w:t>
+      </w:r>
+      <w:r>
+        <w:t xml:space="preserve">25 minutes |</w:t>
+      </w:r>
+      <w:r>
+        <w:t xml:space="preserve"> </w:t>
+      </w:r>
+      <w:r>
+        <w:rPr>
+          <w:b/>
+        </w:rPr>
+        <w:t xml:space="preserve">Type:</w:t>
+      </w:r>
+      <w:r>
+        <w:t xml:space="preserve"> </w:t>
+      </w:r>
+      <w:r>
+        <w:t xml:space="preserve">Media inspection + worksheet</w:t>
+      </w:r>
+    </w:p>
+    <w:p>
+      <w:pPr>
+        <w:pStyle w:val="Heading4"/>
+      </w:pPr>
+      <w:bookmarkStart w:id="41" w:name="scenario"/>
+      <w:r>
+        <w:t xml:space="preserve">Scenario</w:t>
+      </w:r>
       <w:bookmarkEnd w:id="41"/>
     </w:p>
     <w:p>
       <w:pPr>
-        <w:pStyle w:val="Heading3"/>
-      </w:pPr>
-      <w:bookmarkStart w:id="42" w:name="lab-m1-l1-classify-the-media"/>
-      <w:r>
-        <w:t xml:space="preserve">Lab M1-L1: Classify the Media</w:t>
+        <w:pStyle w:val="FirstParagraph"/>
+      </w:pPr>
+      <w:r>
+        <w:t xml:space="preserve">Two USB drives were found in an unlocked desk drawer at ACS Consulting. Before either one can be reused, stored, or thrown away, you must determine whether it holds Federal Contract Information. FCI is information provided by or generated for the government under a contract that is</w:t>
+      </w:r>
+      <w:r>
+        <w:t xml:space="preserve"> </w:t>
+      </w:r>
+      <w:r>
+        <w:rPr>
+          <w:b/>
+        </w:rPr>
+        <w:t xml:space="preserve">not</w:t>
+      </w:r>
+      <w:r>
+        <w:t xml:space="preserve"> </w:t>
+      </w:r>
+      <w:r>
+        <w:t xml:space="preserve">intended for public release.</w:t>
+      </w:r>
+    </w:p>
+    <w:p>
+      <w:pPr>
+        <w:pStyle w:val="Heading4"/>
+      </w:pPr>
+      <w:bookmarkStart w:id="42" w:name="what-you-need-1"/>
+      <w:r>
+        <w:t xml:space="preserve">What You Need</w:t>
       </w:r>
       <w:bookmarkEnd w:id="42"/>
-    </w:p>
-    <w:p>
-      <w:pPr>
-        <w:pStyle w:val="FirstParagraph"/>
-      </w:pPr>
-      <w:r>
-        <w:rPr>
-          <w:b/>
-        </w:rPr>
-        <w:t xml:space="preserve">Difficulty:</w:t>
-      </w:r>
-      <w:r>
-        <w:t xml:space="preserve"> </w:t>
-      </w:r>
-      <w:r>
-        <w:t xml:space="preserve">Beginner |</w:t>
-      </w:r>
-      <w:r>
-        <w:t xml:space="preserve"> </w:t>
-      </w:r>
-      <w:r>
-        <w:rPr>
-          <w:b/>
-        </w:rPr>
-        <w:t xml:space="preserve">Time:</w:t>
-      </w:r>
-      <w:r>
-        <w:t xml:space="preserve"> </w:t>
-      </w:r>
-      <w:r>
-        <w:t xml:space="preserve">25 minutes |</w:t>
-      </w:r>
-      <w:r>
-        <w:t xml:space="preserve"> </w:t>
-      </w:r>
-      <w:r>
-        <w:rPr>
-          <w:b/>
-        </w:rPr>
-        <w:t xml:space="preserve">Type:</w:t>
-      </w:r>
-      <w:r>
-        <w:t xml:space="preserve"> </w:t>
-      </w:r>
-      <w:r>
-        <w:t xml:space="preserve">Media inspection + worksheet</w:t>
-      </w:r>
-    </w:p>
-    <w:p>
-      <w:pPr>
-        <w:pStyle w:val="Heading4"/>
-      </w:pPr>
-      <w:bookmarkStart w:id="43" w:name="scenario"/>
-      <w:r>
-        <w:t xml:space="preserve">Scenario</w:t>
-      </w:r>
-      <w:bookmarkEnd w:id="43"/>
-    </w:p>
-    <w:p>
-      <w:pPr>
-        <w:pStyle w:val="FirstParagraph"/>
-      </w:pPr>
-      <w:r>
-        <w:t xml:space="preserve">Two USB drives were found in an unlocked desk drawer at ACS Consulting. Before either one can be reused, stored, or thrown away, you must determine whether it holds Federal Contract Information. FCI is information provided by or generated for the government under a contract that is</w:t>
-      </w:r>
-      <w:r>
-        <w:t xml:space="preserve"> </w:t>
-      </w:r>
-      <w:r>
-        <w:rPr>
-          <w:b/>
-        </w:rPr>
-        <w:t xml:space="preserve">not</w:t>
-      </w:r>
-      <w:r>
-        <w:t xml:space="preserve"> </w:t>
-      </w:r>
-      <w:r>
-        <w:t xml:space="preserve">intended for public release.</w:t>
-      </w:r>
-    </w:p>
-    <w:p>
-      <w:pPr>
-        <w:pStyle w:val="Heading4"/>
-      </w:pPr>
-      <w:bookmarkStart w:id="44" w:name="what-you-need-1"/>
-      <w:r>
-        <w:t xml:space="preserve">What You Need</w:t>
-      </w:r>
-      <w:bookmarkEnd w:id="44"/>
-    </w:p>
-    <w:p>
-      <w:pPr>
-        <w:numPr>
-          <w:ilvl w:val="0"/>
-          <w:numId w:val="1013"/>
-        </w:numPr>
-        <w:pStyle w:val="Compact"/>
-      </w:pPr>
-      <w:r>
-        <w:rPr>
-          <w:rStyle w:val="VerbatimChar"/>
-        </w:rPr>
-        <w:t xml:space="preserve">PXX-FCI-USB.vhdx</w:t>
-      </w:r>
-    </w:p>
-    <w:p>
-      <w:pPr>
-        <w:numPr>
-          <w:ilvl w:val="0"/>
-          <w:numId w:val="1013"/>
-        </w:numPr>
-        <w:pStyle w:val="Compact"/>
-      </w:pPr>
-      <w:r>
-        <w:rPr>
-          <w:rStyle w:val="VerbatimChar"/>
-        </w:rPr>
-        <w:t xml:space="preserve">PXX-Employee-Handbook.vhdx</w:t>
-      </w:r>
-    </w:p>
-    <w:p>
-      <w:pPr>
-        <w:numPr>
-          <w:ilvl w:val="0"/>
-          <w:numId w:val="1013"/>
-        </w:numPr>
-        <w:pStyle w:val="Compact"/>
-      </w:pPr>
-      <w:r>
-        <w:rPr>
-          <w:rStyle w:val="VerbatimChar"/>
-        </w:rPr>
-        <w:t xml:space="preserve">MediaInventory.xlsx</w:t>
-      </w:r>
-      <w:r>
-        <w:t xml:space="preserve">,</w:t>
-      </w:r>
-      <w:r>
-        <w:t xml:space="preserve"> </w:t>
-      </w:r>
-      <w:r>
-        <w:rPr>
-          <w:rStyle w:val="VerbatimChar"/>
-        </w:rPr>
-        <w:t xml:space="preserve">MediaClassificationWorksheet.docx</w:t>
-      </w:r>
-      <w:r>
-        <w:t xml:space="preserve">,</w:t>
-      </w:r>
-      <w:r>
-        <w:t xml:space="preserve"> </w:t>
-      </w:r>
-      <w:r>
-        <w:rPr>
-          <w:rStyle w:val="VerbatimChar"/>
-        </w:rPr>
-        <w:t xml:space="preserve">MediaDisposalPolicy.pdf</w:t>
-      </w:r>
-    </w:p>
-    <w:p>
-      <w:pPr>
-        <w:numPr>
-          <w:ilvl w:val="0"/>
-          <w:numId w:val="1013"/>
-        </w:numPr>
-        <w:pStyle w:val="Compact"/>
-      </w:pPr>
-      <w:r>
-        <w:t xml:space="preserve">Answer file:</w:t>
-      </w:r>
-      <w:r>
-        <w:t xml:space="preserve"> </w:t>
-      </w:r>
-      <w:r>
-        <w:rPr>
-          <w:rStyle w:val="VerbatimChar"/>
-        </w:rPr>
-        <w:t xml:space="preserve">MediaClassificationResponses.csv</w:t>
-      </w:r>
-    </w:p>
-    <w:p>
-      <w:pPr>
-        <w:pStyle w:val="Heading4"/>
-      </w:pPr>
-      <w:bookmarkStart w:id="45" w:name="steps"/>
-      <w:r>
-        <w:t xml:space="preserve">Steps</w:t>
-      </w:r>
-      <w:bookmarkEnd w:id="45"/>
     </w:p>
     <w:p>
       <w:pPr>
@@ -2614,39 +2480,13 @@
           <w:ilvl w:val="0"/>
           <w:numId w:val="1014"/>
         </w:numPr>
-      </w:pPr>
-      <w:r>
-        <w:rPr>
-          <w:b/>
-        </w:rPr>
-        <w:t xml:space="preserve">Read the policy first:</w:t>
-      </w:r>
-    </w:p>
-    <w:p>
-      <w:pPr>
-        <w:numPr>
-          <w:ilvl w:val="1"/>
-          <w:numId w:val="1015"/>
-        </w:numPr>
-        <w:pStyle w:val="Compact"/>
-      </w:pPr>
-      <w:r>
-        <w:t xml:space="preserve">Open</w:t>
-      </w:r>
-      <w:r>
-        <w:t xml:space="preserve"> </w:t>
-      </w:r>
-      <w:r>
-        <w:rPr>
-          <w:rStyle w:val="VerbatimChar"/>
-        </w:rPr>
-        <w:t xml:space="preserve">MediaDisposalPolicy.pdf</w:t>
-      </w:r>
-      <w:r>
-        <w:t xml:space="preserve"> </w:t>
-      </w:r>
-      <w:r>
-        <w:t xml:space="preserve">and note how the policy defines FCI and what handling it requires</w:t>
+        <w:pStyle w:val="Compact"/>
+      </w:pPr>
+      <w:r>
+        <w:rPr>
+          <w:rStyle w:val="VerbatimChar"/>
+        </w:rPr>
+        <w:t xml:space="preserve">PXX-FCI-USB.vhdx</w:t>
       </w:r>
     </w:p>
     <w:p>
@@ -2655,12 +2495,97 @@
           <w:ilvl w:val="0"/>
           <w:numId w:val="1014"/>
         </w:numPr>
-      </w:pPr>
-      <w:r>
-        <w:rPr>
-          <w:b/>
-        </w:rPr>
-        <w:t xml:space="preserve">Mount and inspect the first drive:</w:t>
+        <w:pStyle w:val="Compact"/>
+      </w:pPr>
+      <w:r>
+        <w:rPr>
+          <w:rStyle w:val="VerbatimChar"/>
+        </w:rPr>
+        <w:t xml:space="preserve">PXX-Employee-Handbook.vhdx</w:t>
+      </w:r>
+    </w:p>
+    <w:p>
+      <w:pPr>
+        <w:numPr>
+          <w:ilvl w:val="0"/>
+          <w:numId w:val="1014"/>
+        </w:numPr>
+        <w:pStyle w:val="Compact"/>
+      </w:pPr>
+      <w:r>
+        <w:rPr>
+          <w:rStyle w:val="VerbatimChar"/>
+        </w:rPr>
+        <w:t xml:space="preserve">MediaInventory.xlsx</w:t>
+      </w:r>
+      <w:r>
+        <w:t xml:space="preserve">,</w:t>
+      </w:r>
+      <w:r>
+        <w:t xml:space="preserve"> </w:t>
+      </w:r>
+      <w:r>
+        <w:rPr>
+          <w:rStyle w:val="VerbatimChar"/>
+        </w:rPr>
+        <w:t xml:space="preserve">MediaClassificationWorksheet.docx</w:t>
+      </w:r>
+      <w:r>
+        <w:t xml:space="preserve">,</w:t>
+      </w:r>
+      <w:r>
+        <w:t xml:space="preserve"> </w:t>
+      </w:r>
+      <w:r>
+        <w:rPr>
+          <w:rStyle w:val="VerbatimChar"/>
+        </w:rPr>
+        <w:t xml:space="preserve">MediaDisposalPolicy.pdf</w:t>
+      </w:r>
+    </w:p>
+    <w:p>
+      <w:pPr>
+        <w:numPr>
+          <w:ilvl w:val="0"/>
+          <w:numId w:val="1014"/>
+        </w:numPr>
+        <w:pStyle w:val="Compact"/>
+      </w:pPr>
+      <w:r>
+        <w:t xml:space="preserve">Answer file:</w:t>
+      </w:r>
+      <w:r>
+        <w:t xml:space="preserve"> </w:t>
+      </w:r>
+      <w:r>
+        <w:rPr>
+          <w:rStyle w:val="VerbatimChar"/>
+        </w:rPr>
+        <w:t xml:space="preserve">MediaClassificationResponses.csv</w:t>
+      </w:r>
+    </w:p>
+    <w:p>
+      <w:pPr>
+        <w:pStyle w:val="Heading4"/>
+      </w:pPr>
+      <w:bookmarkStart w:id="43" w:name="steps"/>
+      <w:r>
+        <w:t xml:space="preserve">Steps</w:t>
+      </w:r>
+      <w:bookmarkEnd w:id="43"/>
+    </w:p>
+    <w:p>
+      <w:pPr>
+        <w:numPr>
+          <w:ilvl w:val="0"/>
+          <w:numId w:val="1015"/>
+        </w:numPr>
+      </w:pPr>
+      <w:r>
+        <w:rPr>
+          <w:b/>
+        </w:rPr>
+        <w:t xml:space="preserve">Read the policy first:</w:t>
       </w:r>
     </w:p>
     <w:p>
@@ -2672,213 +2597,36 @@
         <w:pStyle w:val="Compact"/>
       </w:pPr>
       <w:r>
-        <w:t xml:space="preserve">Double-click</w:t>
-      </w:r>
-      <w:r>
-        <w:t xml:space="preserve"> </w:t>
-      </w:r>
-      <w:r>
-        <w:rPr>
-          <w:rStyle w:val="VerbatimChar"/>
-        </w:rPr>
-        <w:t xml:space="preserve">PXX-FCI-USB.vhdx</w:t>
-      </w:r>
-    </w:p>
-    <w:p>
-      <w:pPr>
-        <w:numPr>
-          <w:ilvl w:val="1"/>
-          <w:numId w:val="1016"/>
-        </w:numPr>
-        <w:pStyle w:val="Compact"/>
-      </w:pPr>
-      <w:r>
-        <w:t xml:space="preserve">Turn on</w:t>
-      </w:r>
-      <w:r>
-        <w:t xml:space="preserve"> </w:t>
-      </w:r>
-      <w:r>
-        <w:rPr>
-          <w:b/>
-        </w:rPr>
-        <w:t xml:space="preserve">Hidden items</w:t>
-      </w:r>
-      <w:r>
-        <w:t xml:space="preserve"> </w:t>
-      </w:r>
-      <w:r>
-        <w:t xml:space="preserve">in the View ribbon</w:t>
-      </w:r>
-    </w:p>
-    <w:p>
-      <w:pPr>
-        <w:numPr>
-          <w:ilvl w:val="1"/>
-          <w:numId w:val="1016"/>
-        </w:numPr>
-        <w:pStyle w:val="Compact"/>
-      </w:pPr>
-      <w:r>
-        <w:t xml:space="preserve">Browse every folder:</w:t>
-      </w:r>
-      <w:r>
-        <w:t xml:space="preserve"> </w:t>
-      </w:r>
-      <w:r>
-        <w:rPr>
-          <w:rStyle w:val="VerbatimChar"/>
-        </w:rPr>
-        <w:t xml:space="preserve">Contracts</w:t>
-      </w:r>
-      <w:r>
-        <w:t xml:space="preserve">,</w:t>
-      </w:r>
-      <w:r>
-        <w:t xml:space="preserve"> </w:t>
-      </w:r>
-      <w:r>
-        <w:rPr>
-          <w:rStyle w:val="VerbatimChar"/>
-        </w:rPr>
-        <w:t xml:space="preserve">Purchase Orders</w:t>
-      </w:r>
-      <w:r>
-        <w:t xml:space="preserve">,</w:t>
-      </w:r>
-      <w:r>
-        <w:t xml:space="preserve"> </w:t>
-      </w:r>
-      <w:r>
-        <w:rPr>
-          <w:rStyle w:val="VerbatimChar"/>
-        </w:rPr>
-        <w:t xml:space="preserve">Drawings</w:t>
-      </w:r>
-      <w:r>
-        <w:t xml:space="preserve">,</w:t>
-      </w:r>
-      <w:r>
-        <w:t xml:space="preserve"> </w:t>
-      </w:r>
-      <w:r>
-        <w:rPr>
-          <w:rStyle w:val="VerbatimChar"/>
-        </w:rPr>
-        <w:t xml:space="preserve">Invoices</w:t>
-      </w:r>
-      <w:r>
-        <w:t xml:space="preserve">,</w:t>
-      </w:r>
-      <w:r>
-        <w:t xml:space="preserve"> </w:t>
-      </w:r>
-      <w:r>
-        <w:rPr>
-          <w:rStyle w:val="VerbatimChar"/>
-        </w:rPr>
-        <w:t xml:space="preserve">General Office</w:t>
-      </w:r>
-      <w:r>
-        <w:t xml:space="preserve">, and the hidden</w:t>
-      </w:r>
-      <w:r>
-        <w:t xml:space="preserve"> </w:t>
-      </w:r>
-      <w:r>
-        <w:rPr>
-          <w:rStyle w:val="VerbatimChar"/>
-        </w:rPr>
-        <w:t xml:space="preserve">Hidden Archive</w:t>
-      </w:r>
-      <w:r>
-        <w:t xml:space="preserve"> </w:t>
-      </w:r>
-      <w:r>
-        <w:t xml:space="preserve">and</w:t>
-      </w:r>
-      <w:r>
-        <w:t xml:space="preserve"> </w:t>
-      </w:r>
-      <w:r>
-        <w:rPr>
-          <w:rStyle w:val="VerbatimChar"/>
-        </w:rPr>
-        <w:t xml:space="preserve">Temp</w:t>
-      </w:r>
-      <w:r>
-        <w:t xml:space="preserve"> </w:t>
-      </w:r>
-      <w:r>
-        <w:t xml:space="preserve">folders</w:t>
-      </w:r>
-    </w:p>
-    <w:p>
-      <w:pPr>
-        <w:numPr>
-          <w:ilvl w:val="1"/>
-          <w:numId w:val="1016"/>
-        </w:numPr>
-        <w:pStyle w:val="Compact"/>
-      </w:pPr>
-      <w:r>
-        <w:t xml:space="preserve">Open a few files. Look for the contract number</w:t>
-      </w:r>
-      <w:r>
-        <w:t xml:space="preserve"> </w:t>
-      </w:r>
-      <w:r>
-        <w:rPr>
-          <w:rStyle w:val="VerbatimChar"/>
-        </w:rPr>
-        <w:t xml:space="preserve">FA-2026-PXX</w:t>
-      </w:r>
-      <w:r>
-        <w:t xml:space="preserve"> </w:t>
-      </w:r>
-      <w:r>
-        <w:t xml:space="preserve">— that is a federal contract reference</w:t>
-      </w:r>
-    </w:p>
-    <w:p>
-      <w:pPr>
-        <w:numPr>
-          <w:ilvl w:val="1"/>
-          <w:numId w:val="1016"/>
-        </w:numPr>
-        <w:pStyle w:val="Compact"/>
-      </w:pPr>
-      <w:r>
-        <w:t xml:space="preserve">Note that some FCI is hidden or in a temp file. Media is classified by the</w:t>
-      </w:r>
-      <w:r>
-        <w:t xml:space="preserve"> </w:t>
-      </w:r>
-      <w:r>
-        <w:rPr>
-          <w:b/>
-        </w:rPr>
-        <w:t xml:space="preserve">most sensitive</w:t>
-      </w:r>
-      <w:r>
-        <w:t xml:space="preserve"> </w:t>
-      </w:r>
-      <w:r>
-        <w:t xml:space="preserve">thing on it, so one contract file is enough to make the whole drive FCI</w:t>
+        <w:t xml:space="preserve">Open</w:t>
+      </w:r>
+      <w:r>
+        <w:t xml:space="preserve"> </w:t>
+      </w:r>
+      <w:r>
+        <w:rPr>
+          <w:rStyle w:val="VerbatimChar"/>
+        </w:rPr>
+        <w:t xml:space="preserve">MediaDisposalPolicy.pdf</w:t>
+      </w:r>
+      <w:r>
+        <w:t xml:space="preserve"> </w:t>
+      </w:r>
+      <w:r>
+        <w:t xml:space="preserve">and note how the policy defines FCI and what handling it requires</w:t>
       </w:r>
     </w:p>
     <w:p>
       <w:pPr>
         <w:numPr>
           <w:ilvl w:val="0"/>
-          <w:numId w:val="1014"/>
-        </w:numPr>
-      </w:pPr>
-      <w:r>
-        <w:rPr>
-          <w:b/>
-        </w:rPr>
-        <w:t xml:space="preserve">Mount and inspect the second drive:</w:t>
+          <w:numId w:val="1015"/>
+        </w:numPr>
+      </w:pPr>
+      <w:r>
+        <w:rPr>
+          <w:b/>
+        </w:rPr>
+        <w:t xml:space="preserve">Inspect the first drive:</w:t>
       </w:r>
     </w:p>
     <w:p>
@@ -2890,16 +2638,16 @@
         <w:pStyle w:val="Compact"/>
       </w:pPr>
       <w:r>
-        <w:t xml:space="preserve">Double-click</w:t>
-      </w:r>
-      <w:r>
-        <w:t xml:space="preserve"> </w:t>
-      </w:r>
-      <w:r>
-        <w:rPr>
-          <w:rStyle w:val="VerbatimChar"/>
-        </w:rPr>
-        <w:t xml:space="preserve">PXX-Employee-Handbook.vhdx</w:t>
+        <w:t xml:space="preserve">Open</w:t>
+      </w:r>
+      <w:r>
+        <w:t xml:space="preserve"> </w:t>
+      </w:r>
+      <w:r>
+        <w:rPr>
+          <w:rStyle w:val="VerbatimChar"/>
+        </w:rPr>
+        <w:t xml:space="preserve">PXX-FCI-USB-Contents.txt</w:t>
       </w:r>
     </w:p>
     <w:p>
@@ -2911,16 +2659,16 @@
         <w:pStyle w:val="Compact"/>
       </w:pPr>
       <w:r>
-        <w:t xml:space="preserve">Review</w:t>
-      </w:r>
-      <w:r>
-        <w:t xml:space="preserve"> </w:t>
-      </w:r>
-      <w:r>
-        <w:rPr>
-          <w:rStyle w:val="VerbatimChar"/>
-        </w:rPr>
-        <w:t xml:space="preserve">Policies\Employee-Handbook.txt</w:t>
+        <w:t xml:space="preserve">Read every folder listed:</w:t>
+      </w:r>
+      <w:r>
+        <w:t xml:space="preserve"> </w:t>
+      </w:r>
+      <w:r>
+        <w:rPr>
+          <w:rStyle w:val="VerbatimChar"/>
+        </w:rPr>
+        <w:t xml:space="preserve">Contracts</w:t>
       </w:r>
       <w:r>
         <w:t xml:space="preserve">,</w:t>
@@ -2932,7 +2680,7 @@
         <w:rPr>
           <w:rStyle w:val="VerbatimChar"/>
         </w:rPr>
-        <w:t xml:space="preserve">Benefits\Benefits-Guide.txt</w:t>
+        <w:t xml:space="preserve">Purchase Orders</w:t>
       </w:r>
       <w:r>
         <w:t xml:space="preserve">,</w:t>
@@ -2944,7 +2692,64 @@
         <w:rPr>
           <w:rStyle w:val="VerbatimChar"/>
         </w:rPr>
-        <w:t xml:space="preserve">General Office\Holiday-Calendar.txt</w:t>
+        <w:t xml:space="preserve">Drawings</w:t>
+      </w:r>
+      <w:r>
+        <w:t xml:space="preserve">,</w:t>
+      </w:r>
+      <w:r>
+        <w:t xml:space="preserve"> </w:t>
+      </w:r>
+      <w:r>
+        <w:rPr>
+          <w:rStyle w:val="VerbatimChar"/>
+        </w:rPr>
+        <w:t xml:space="preserve">Invoices</w:t>
+      </w:r>
+      <w:r>
+        <w:t xml:space="preserve">,</w:t>
+      </w:r>
+      <w:r>
+        <w:t xml:space="preserve"> </w:t>
+      </w:r>
+      <w:r>
+        <w:rPr>
+          <w:rStyle w:val="VerbatimChar"/>
+        </w:rPr>
+        <w:t xml:space="preserve">General Office</w:t>
+      </w:r>
+      <w:r>
+        <w:t xml:space="preserve">, and the hidden</w:t>
+      </w:r>
+      <w:r>
+        <w:t xml:space="preserve"> </w:t>
+      </w:r>
+      <w:r>
+        <w:rPr>
+          <w:rStyle w:val="VerbatimChar"/>
+        </w:rPr>
+        <w:t xml:space="preserve">Hidden Archive</w:t>
+      </w:r>
+      <w:r>
+        <w:t xml:space="preserve"> </w:t>
+      </w:r>
+      <w:r>
+        <w:t xml:space="preserve">and</w:t>
+      </w:r>
+      <w:r>
+        <w:t xml:space="preserve"> </w:t>
+      </w:r>
+      <w:r>
+        <w:rPr>
+          <w:rStyle w:val="VerbatimChar"/>
+        </w:rPr>
+        <w:t xml:space="preserve">Temp</w:t>
+      </w:r>
+      <w:r>
+        <w:t xml:space="preserve"> </w:t>
+      </w:r>
+      <w:r>
+        <w:t xml:space="preserve">folders</w:t>
       </w:r>
     </w:p>
     <w:p>
@@ -2956,21 +2761,57 @@
         <w:pStyle w:val="Compact"/>
       </w:pPr>
       <w:r>
-        <w:t xml:space="preserve">These are internal general business documents — no contract data, no government deliverables</w:t>
+        <w:t xml:space="preserve">Look for file names referencing the federal contract</w:t>
+      </w:r>
+      <w:r>
+        <w:t xml:space="preserve"> </w:t>
+      </w:r>
+      <w:r>
+        <w:rPr>
+          <w:rStyle w:val="VerbatimChar"/>
+        </w:rPr>
+        <w:t xml:space="preserve">FA-2026-PXX</w:t>
+      </w:r>
+    </w:p>
+    <w:p>
+      <w:pPr>
+        <w:numPr>
+          <w:ilvl w:val="1"/>
+          <w:numId w:val="1017"/>
+        </w:numPr>
+        <w:pStyle w:val="Compact"/>
+      </w:pPr>
+      <w:r>
+        <w:t xml:space="preserve">Note that some FCI is in hidden folders or a temp file. Media is classified by the</w:t>
+      </w:r>
+      <w:r>
+        <w:t xml:space="preserve"> </w:t>
+      </w:r>
+      <w:r>
+        <w:rPr>
+          <w:b/>
+        </w:rPr>
+        <w:t xml:space="preserve">most sensitive</w:t>
+      </w:r>
+      <w:r>
+        <w:t xml:space="preserve"> </w:t>
+      </w:r>
+      <w:r>
+        <w:t xml:space="preserve">thing on it, so one contract file is enough to make the whole drive FCI</w:t>
       </w:r>
     </w:p>
     <w:p>
       <w:pPr>
         <w:numPr>
           <w:ilvl w:val="0"/>
-          <w:numId w:val="1014"/>
-        </w:numPr>
-      </w:pPr>
-      <w:r>
-        <w:rPr>
-          <w:b/>
-        </w:rPr>
-        <w:t xml:space="preserve">Complete the worksheet:</w:t>
+          <w:numId w:val="1015"/>
+        </w:numPr>
+      </w:pPr>
+      <w:r>
+        <w:rPr>
+          <w:b/>
+        </w:rPr>
+        <w:t xml:space="preserve">Inspect the second drive:</w:t>
       </w:r>
     </w:p>
     <w:p>
@@ -2991,13 +2832,7 @@
         <w:rPr>
           <w:rStyle w:val="VerbatimChar"/>
         </w:rPr>
-        <w:t xml:space="preserve">MediaClassificationWorksheet.docx</w:t>
-      </w:r>
-      <w:r>
-        <w:t xml:space="preserve"> </w:t>
-      </w:r>
-      <w:r>
-        <w:t xml:space="preserve">and record, for each drive, what you found and why it does or does not meet the FCI definition</w:t>
+        <w:t xml:space="preserve">PXX-Employee-Handbook-Contents.txt</w:t>
       </w:r>
     </w:p>
     <w:p>
@@ -3009,6 +2844,104 @@
         <w:pStyle w:val="Compact"/>
       </w:pPr>
       <w:r>
+        <w:t xml:space="preserve">Review</w:t>
+      </w:r>
+      <w:r>
+        <w:t xml:space="preserve"> </w:t>
+      </w:r>
+      <w:r>
+        <w:rPr>
+          <w:rStyle w:val="VerbatimChar"/>
+        </w:rPr>
+        <w:t xml:space="preserve">Policies\Employee-Handbook.txt</w:t>
+      </w:r>
+      <w:r>
+        <w:t xml:space="preserve">,</w:t>
+      </w:r>
+      <w:r>
+        <w:t xml:space="preserve"> </w:t>
+      </w:r>
+      <w:r>
+        <w:rPr>
+          <w:rStyle w:val="VerbatimChar"/>
+        </w:rPr>
+        <w:t xml:space="preserve">Benefits\Benefits-Guide.txt</w:t>
+      </w:r>
+      <w:r>
+        <w:t xml:space="preserve">,</w:t>
+      </w:r>
+      <w:r>
+        <w:t xml:space="preserve"> </w:t>
+      </w:r>
+      <w:r>
+        <w:rPr>
+          <w:rStyle w:val="VerbatimChar"/>
+        </w:rPr>
+        <w:t xml:space="preserve">General Office\Holiday-Calendar.txt</w:t>
+      </w:r>
+    </w:p>
+    <w:p>
+      <w:pPr>
+        <w:numPr>
+          <w:ilvl w:val="1"/>
+          <w:numId w:val="1018"/>
+        </w:numPr>
+        <w:pStyle w:val="Compact"/>
+      </w:pPr>
+      <w:r>
+        <w:t xml:space="preserve">These are internal general business documents — no contract data, no government deliverables</w:t>
+      </w:r>
+    </w:p>
+    <w:p>
+      <w:pPr>
+        <w:numPr>
+          <w:ilvl w:val="0"/>
+          <w:numId w:val="1015"/>
+        </w:numPr>
+      </w:pPr>
+      <w:r>
+        <w:rPr>
+          <w:b/>
+        </w:rPr>
+        <w:t xml:space="preserve">Complete the worksheet:</w:t>
+      </w:r>
+    </w:p>
+    <w:p>
+      <w:pPr>
+        <w:numPr>
+          <w:ilvl w:val="1"/>
+          <w:numId w:val="1019"/>
+        </w:numPr>
+        <w:pStyle w:val="Compact"/>
+      </w:pPr>
+      <w:r>
+        <w:t xml:space="preserve">Open</w:t>
+      </w:r>
+      <w:r>
+        <w:t xml:space="preserve"> </w:t>
+      </w:r>
+      <w:r>
+        <w:rPr>
+          <w:rStyle w:val="VerbatimChar"/>
+        </w:rPr>
+        <w:t xml:space="preserve">MediaClassificationWorksheet.docx</w:t>
+      </w:r>
+      <w:r>
+        <w:t xml:space="preserve"> </w:t>
+      </w:r>
+      <w:r>
+        <w:t xml:space="preserve">and record, for each drive, what you found and why it does or does not meet the FCI definition</w:t>
+      </w:r>
+    </w:p>
+    <w:p>
+      <w:pPr>
+        <w:numPr>
+          <w:ilvl w:val="1"/>
+          <w:numId w:val="1019"/>
+        </w:numPr>
+        <w:pStyle w:val="Compact"/>
+      </w:pPr>
+      <w:r>
         <w:t xml:space="preserve">Cross-check</w:t>
       </w:r>
       <w:r>
@@ -3031,7 +2964,7 @@
       <w:pPr>
         <w:numPr>
           <w:ilvl w:val="0"/>
-          <w:numId w:val="1014"/>
+          <w:numId w:val="1015"/>
         </w:numPr>
       </w:pPr>
       <w:r>
@@ -3282,154 +3215,134 @@
     </w:p>
     <w:p>
       <w:pPr>
+        <w:pStyle w:val="Heading4"/>
+      </w:pPr>
+      <w:bookmarkStart w:id="44" w:name="completion-criteria"/>
+      <w:r>
+        <w:t xml:space="preserve">Completion Criteria</w:t>
+      </w:r>
+      <w:bookmarkEnd w:id="44"/>
+    </w:p>
+    <w:p>
+      <w:pPr>
         <w:numPr>
           <w:ilvl w:val="0"/>
-          <w:numId w:val="1014"/>
-        </w:numPr>
-      </w:pPr>
-      <w:r>
-        <w:rPr>
-          <w:b/>
-        </w:rPr>
-        <w:t xml:space="preserve">Eject both drives</w:t>
-      </w:r>
-      <w:r>
-        <w:t xml:space="preserve"> </w:t>
-      </w:r>
-      <w:r>
-        <w:t xml:space="preserve">when finished</w:t>
+          <w:numId w:val="1020"/>
+        </w:numPr>
+        <w:pStyle w:val="Compact"/>
+      </w:pPr>
+      <w:r>
+        <w:t xml:space="preserve">☐</w:t>
+      </w:r>
+      <w:r>
+        <w:t xml:space="preserve"> </w:t>
+      </w:r>
+      <w:r>
+        <w:rPr>
+          <w:rStyle w:val="VerbatimChar"/>
+        </w:rPr>
+        <w:t xml:space="preserve">PXX-FCI-USB.vhdx</w:t>
+      </w:r>
+      <w:r>
+        <w:t xml:space="preserve"> </w:t>
+      </w:r>
+      <w:r>
+        <w:t xml:space="preserve">is classified as</w:t>
+      </w:r>
+      <w:r>
+        <w:t xml:space="preserve"> </w:t>
+      </w:r>
+      <w:r>
+        <w:rPr>
+          <w:rStyle w:val="VerbatimChar"/>
+        </w:rPr>
+        <w:t xml:space="preserve">FCI</w:t>
+      </w:r>
+    </w:p>
+    <w:p>
+      <w:pPr>
+        <w:numPr>
+          <w:ilvl w:val="0"/>
+          <w:numId w:val="1020"/>
+        </w:numPr>
+        <w:pStyle w:val="Compact"/>
+      </w:pPr>
+      <w:r>
+        <w:t xml:space="preserve">☐</w:t>
+      </w:r>
+      <w:r>
+        <w:t xml:space="preserve"> </w:t>
+      </w:r>
+      <w:r>
+        <w:rPr>
+          <w:rStyle w:val="VerbatimChar"/>
+        </w:rPr>
+        <w:t xml:space="preserve">PXX-Employee-Handbook.vhdx</w:t>
+      </w:r>
+      <w:r>
+        <w:t xml:space="preserve"> </w:t>
+      </w:r>
+      <w:r>
+        <w:t xml:space="preserve">is classified as</w:t>
+      </w:r>
+      <w:r>
+        <w:t xml:space="preserve"> </w:t>
+      </w:r>
+      <w:r>
+        <w:rPr>
+          <w:rStyle w:val="VerbatimChar"/>
+        </w:rPr>
+        <w:t xml:space="preserve">Non-FCI</w:t>
+      </w:r>
+    </w:p>
+    <w:p>
+      <w:pPr>
+        <w:numPr>
+          <w:ilvl w:val="0"/>
+          <w:numId w:val="1020"/>
+        </w:numPr>
+        <w:pStyle w:val="Compact"/>
+      </w:pPr>
+      <w:r>
+        <w:t xml:space="preserve">☐ Both rows have specific written evidence (a short phrase is not enough)</w:t>
+      </w:r>
+    </w:p>
+    <w:p>
+      <w:pPr>
+        <w:numPr>
+          <w:ilvl w:val="0"/>
+          <w:numId w:val="1020"/>
+        </w:numPr>
+        <w:pStyle w:val="Compact"/>
+      </w:pPr>
+      <w:r>
+        <w:t xml:space="preserve">☐ Worksheet, inventory, policy and both</w:t>
+      </w:r>
+      <w:r>
+        <w:t xml:space="preserve"> </w:t>
+      </w:r>
+      <w:r>
+        <w:rPr>
+          <w:rStyle w:val="VerbatimChar"/>
+        </w:rPr>
+        <w:t xml:space="preserve">.vhdx</w:t>
+      </w:r>
+      <w:r>
+        <w:t xml:space="preserve"> </w:t>
+      </w:r>
+      <w:r>
+        <w:t xml:space="preserve">files are still present in the folder</w:t>
       </w:r>
     </w:p>
     <w:p>
       <w:pPr>
         <w:pStyle w:val="Heading4"/>
       </w:pPr>
-      <w:bookmarkStart w:id="46" w:name="completion-criteria"/>
-      <w:r>
-        <w:t xml:space="preserve">Completion Criteria</w:t>
-      </w:r>
-      <w:bookmarkEnd w:id="46"/>
-    </w:p>
-    <w:p>
-      <w:pPr>
-        <w:numPr>
-          <w:ilvl w:val="0"/>
-          <w:numId w:val="1019"/>
-        </w:numPr>
-        <w:pStyle w:val="Compact"/>
-      </w:pPr>
-      <w:r>
-        <w:t xml:space="preserve">☐</w:t>
-      </w:r>
-      <w:r>
-        <w:t xml:space="preserve"> </w:t>
-      </w:r>
-      <w:r>
-        <w:rPr>
-          <w:rStyle w:val="VerbatimChar"/>
-        </w:rPr>
-        <w:t xml:space="preserve">PXX-FCI-USB.vhdx</w:t>
-      </w:r>
-      <w:r>
-        <w:t xml:space="preserve"> </w:t>
-      </w:r>
-      <w:r>
-        <w:t xml:space="preserve">is classified as</w:t>
-      </w:r>
-      <w:r>
-        <w:t xml:space="preserve"> </w:t>
-      </w:r>
-      <w:r>
-        <w:rPr>
-          <w:rStyle w:val="VerbatimChar"/>
-        </w:rPr>
-        <w:t xml:space="preserve">FCI</w:t>
-      </w:r>
-    </w:p>
-    <w:p>
-      <w:pPr>
-        <w:numPr>
-          <w:ilvl w:val="0"/>
-          <w:numId w:val="1019"/>
-        </w:numPr>
-        <w:pStyle w:val="Compact"/>
-      </w:pPr>
-      <w:r>
-        <w:t xml:space="preserve">☐</w:t>
-      </w:r>
-      <w:r>
-        <w:t xml:space="preserve"> </w:t>
-      </w:r>
-      <w:r>
-        <w:rPr>
-          <w:rStyle w:val="VerbatimChar"/>
-        </w:rPr>
-        <w:t xml:space="preserve">PXX-Employee-Handbook.vhdx</w:t>
-      </w:r>
-      <w:r>
-        <w:t xml:space="preserve"> </w:t>
-      </w:r>
-      <w:r>
-        <w:t xml:space="preserve">is classified as</w:t>
-      </w:r>
-      <w:r>
-        <w:t xml:space="preserve"> </w:t>
-      </w:r>
-      <w:r>
-        <w:rPr>
-          <w:rStyle w:val="VerbatimChar"/>
-        </w:rPr>
-        <w:t xml:space="preserve">Non-FCI</w:t>
-      </w:r>
-    </w:p>
-    <w:p>
-      <w:pPr>
-        <w:numPr>
-          <w:ilvl w:val="0"/>
-          <w:numId w:val="1019"/>
-        </w:numPr>
-        <w:pStyle w:val="Compact"/>
-      </w:pPr>
-      <w:r>
-        <w:t xml:space="preserve">☐ Both rows have specific written evidence (a short phrase is not enough)</w:t>
-      </w:r>
-    </w:p>
-    <w:p>
-      <w:pPr>
-        <w:numPr>
-          <w:ilvl w:val="0"/>
-          <w:numId w:val="1019"/>
-        </w:numPr>
-        <w:pStyle w:val="Compact"/>
-      </w:pPr>
-      <w:r>
-        <w:t xml:space="preserve">☐ Worksheet, inventory, policy and both</w:t>
-      </w:r>
-      <w:r>
-        <w:t xml:space="preserve"> </w:t>
-      </w:r>
-      <w:r>
-        <w:rPr>
-          <w:rStyle w:val="VerbatimChar"/>
-        </w:rPr>
-        <w:t xml:space="preserve">.vhdx</w:t>
-      </w:r>
-      <w:r>
-        <w:t xml:space="preserve"> </w:t>
-      </w:r>
-      <w:r>
-        <w:t xml:space="preserve">files are still present in the folder</w:t>
-      </w:r>
-    </w:p>
-    <w:p>
-      <w:pPr>
-        <w:pStyle w:val="Heading4"/>
-      </w:pPr>
-      <w:bookmarkStart w:id="47" w:name="why-this-matters"/>
+      <w:bookmarkStart w:id="45" w:name="why-this-matters"/>
       <w:r>
         <w:t xml:space="preserve">Why This Matters</w:t>
       </w:r>
-      <w:bookmarkEnd w:id="47"/>
+      <w:bookmarkEnd w:id="45"/>
     </w:p>
     <w:p>
       <w:pPr>
@@ -3450,201 +3363,148 @@
       <w:pPr>
         <w:pStyle w:val="Heading3"/>
       </w:pPr>
-      <w:bookmarkStart w:id="48" w:name="lab-m1-l2-sanitize-media-for-reuse"/>
+      <w:bookmarkStart w:id="46" w:name="lab-m1-l2-sanitize-media-for-reuse"/>
       <w:r>
         <w:t xml:space="preserve">Lab M1-L2: Sanitize Media for Reuse</w:t>
       </w:r>
+      <w:bookmarkEnd w:id="46"/>
+    </w:p>
+    <w:p>
+      <w:pPr>
+        <w:pStyle w:val="FirstParagraph"/>
+      </w:pPr>
+      <w:r>
+        <w:rPr>
+          <w:b/>
+        </w:rPr>
+        <w:t xml:space="preserve">Difficulty:</w:t>
+      </w:r>
+      <w:r>
+        <w:t xml:space="preserve"> </w:t>
+      </w:r>
+      <w:r>
+        <w:t xml:space="preserve">Intermediate |</w:t>
+      </w:r>
+      <w:r>
+        <w:t xml:space="preserve"> </w:t>
+      </w:r>
+      <w:r>
+        <w:rPr>
+          <w:b/>
+        </w:rPr>
+        <w:t xml:space="preserve">Time:</w:t>
+      </w:r>
+      <w:r>
+        <w:t xml:space="preserve"> </w:t>
+      </w:r>
+      <w:r>
+        <w:t xml:space="preserve">25 minutes |</w:t>
+      </w:r>
+      <w:r>
+        <w:t xml:space="preserve"> </w:t>
+      </w:r>
+      <w:r>
+        <w:rPr>
+          <w:b/>
+        </w:rPr>
+        <w:t xml:space="preserve">Type:</w:t>
+      </w:r>
+      <w:r>
+        <w:t xml:space="preserve"> </w:t>
+      </w:r>
+      <w:r>
+        <w:t xml:space="preserve">Sanitization records</w:t>
+      </w:r>
+    </w:p>
+    <w:p>
+      <w:pPr>
+        <w:pStyle w:val="BlockText"/>
+      </w:pPr>
+      <w:r>
+        <w:rPr>
+          <w:b/>
+        </w:rPr>
+        <w:t xml:space="preserve">This cohort:</w:t>
+      </w:r>
+      <w:r>
+        <w:t xml:space="preserve"> </w:t>
+      </w:r>
+      <w:r>
+        <w:t xml:space="preserve">re-creating and formatting a volume requires administrator</w:t>
+      </w:r>
+      <w:r>
+        <w:t xml:space="preserve"> </w:t>
+      </w:r>
+      <w:r>
+        <w:t xml:space="preserve">rights on this shared server, so the disk-management step is performed by the</w:t>
+      </w:r>
+      <w:r>
+        <w:t xml:space="preserve"> </w:t>
+      </w:r>
+      <w:r>
+        <w:t xml:space="preserve">instructor and is not graded. Read step 3 so you know how it is done, then</w:t>
+      </w:r>
+      <w:r>
+        <w:t xml:space="preserve"> </w:t>
+      </w:r>
+      <w:r>
+        <w:t xml:space="preserve">complete the log and certificate in step 5 — that is what is graded. When pods</w:t>
+      </w:r>
+      <w:r>
+        <w:t xml:space="preserve"> </w:t>
+      </w:r>
+      <w:r>
+        <w:t xml:space="preserve">move to their own servers you will perform the sanitization yourself.</w:t>
+      </w:r>
+    </w:p>
+    <w:p>
+      <w:pPr>
+        <w:pStyle w:val="Heading4"/>
+      </w:pPr>
+      <w:bookmarkStart w:id="47" w:name="scenario-1"/>
+      <w:r>
+        <w:t xml:space="preserve">Scenario</w:t>
+      </w:r>
+      <w:bookmarkEnd w:id="47"/>
+    </w:p>
+    <w:p>
+      <w:pPr>
+        <w:pStyle w:val="FirstParagraph"/>
+      </w:pPr>
+      <w:r>
+        <w:rPr>
+          <w:rStyle w:val="VerbatimChar"/>
+        </w:rPr>
+        <w:t xml:space="preserve">PXX-FCI-USB</w:t>
+      </w:r>
+      <w:r>
+        <w:t xml:space="preserve"> </w:t>
+      </w:r>
+      <w:r>
+        <w:t xml:space="preserve">is being reassigned to a non-federal project team. Before release for reuse it must be sanitized in accordance with</w:t>
+      </w:r>
+      <w:r>
+        <w:t xml:space="preserve"> </w:t>
+      </w:r>
+      <w:r>
+        <w:rPr>
+          <w:b/>
+        </w:rPr>
+        <w:t xml:space="preserve">ACS-POL-MP-001</w:t>
+      </w:r>
+      <w:r>
+        <w:t xml:space="preserve">. A previous employee "sanitized" a drive by selecting the files and pressing Delete — the data was recovered by an auditor two weeks later. You will do it properly.</w:t>
+      </w:r>
+    </w:p>
+    <w:p>
+      <w:pPr>
+        <w:pStyle w:val="Heading4"/>
+      </w:pPr>
+      <w:bookmarkStart w:id="48" w:name="what-you-need-2"/>
+      <w:r>
+        <w:t xml:space="preserve">What You Need</w:t>
+      </w:r>
       <w:bookmarkEnd w:id="48"/>
-    </w:p>
-    <w:p>
-      <w:pPr>
-        <w:pStyle w:val="FirstParagraph"/>
-      </w:pPr>
-      <w:r>
-        <w:rPr>
-          <w:b/>
-        </w:rPr>
-        <w:t xml:space="preserve">Difficulty:</w:t>
-      </w:r>
-      <w:r>
-        <w:t xml:space="preserve"> </w:t>
-      </w:r>
-      <w:r>
-        <w:t xml:space="preserve">Intermediate |</w:t>
-      </w:r>
-      <w:r>
-        <w:t xml:space="preserve"> </w:t>
-      </w:r>
-      <w:r>
-        <w:rPr>
-          <w:b/>
-        </w:rPr>
-        <w:t xml:space="preserve">Time:</w:t>
-      </w:r>
-      <w:r>
-        <w:t xml:space="preserve"> </w:t>
-      </w:r>
-      <w:r>
-        <w:t xml:space="preserve">40 minutes |</w:t>
-      </w:r>
-      <w:r>
-        <w:t xml:space="preserve"> </w:t>
-      </w:r>
-      <w:r>
-        <w:rPr>
-          <w:b/>
-        </w:rPr>
-        <w:t xml:space="preserve">Type:</w:t>
-      </w:r>
-      <w:r>
-        <w:t xml:space="preserve"> </w:t>
-      </w:r>
-      <w:r>
-        <w:t xml:space="preserve">Hands-on (disk management)</w:t>
-      </w:r>
-    </w:p>
-    <w:p>
-      <w:pPr>
-        <w:pStyle w:val="Heading4"/>
-      </w:pPr>
-      <w:bookmarkStart w:id="49" w:name="scenario-1"/>
-      <w:r>
-        <w:t xml:space="preserve">Scenario</w:t>
-      </w:r>
-      <w:bookmarkEnd w:id="49"/>
-    </w:p>
-    <w:p>
-      <w:pPr>
-        <w:pStyle w:val="FirstParagraph"/>
-      </w:pPr>
-      <w:r>
-        <w:rPr>
-          <w:rStyle w:val="VerbatimChar"/>
-        </w:rPr>
-        <w:t xml:space="preserve">PXX-FCI-USB</w:t>
-      </w:r>
-      <w:r>
-        <w:t xml:space="preserve"> </w:t>
-      </w:r>
-      <w:r>
-        <w:t xml:space="preserve">is being reassigned to a non-federal project team. Before release for reuse it must be sanitized in accordance with</w:t>
-      </w:r>
-      <w:r>
-        <w:t xml:space="preserve"> </w:t>
-      </w:r>
-      <w:r>
-        <w:rPr>
-          <w:b/>
-        </w:rPr>
-        <w:t xml:space="preserve">ACS-POL-MP-001</w:t>
-      </w:r>
-      <w:r>
-        <w:t xml:space="preserve">. A previous employee "sanitized" a drive by selecting the files and pressing Delete — the data was recovered by an auditor two weeks later. You will do it properly.</w:t>
-      </w:r>
-    </w:p>
-    <w:p>
-      <w:pPr>
-        <w:pStyle w:val="Heading4"/>
-      </w:pPr>
-      <w:bookmarkStart w:id="50" w:name="what-you-need-2"/>
-      <w:r>
-        <w:t xml:space="preserve">What You Need</w:t>
-      </w:r>
-      <w:bookmarkEnd w:id="50"/>
-    </w:p>
-    <w:p>
-      <w:pPr>
-        <w:numPr>
-          <w:ilvl w:val="0"/>
-          <w:numId w:val="1020"/>
-        </w:numPr>
-        <w:pStyle w:val="Compact"/>
-      </w:pPr>
-      <w:r>
-        <w:rPr>
-          <w:rStyle w:val="VerbatimChar"/>
-        </w:rPr>
-        <w:t xml:space="preserve">PXX-FCI-USB.vhdx</w:t>
-      </w:r>
-    </w:p>
-    <w:p>
-      <w:pPr>
-        <w:numPr>
-          <w:ilvl w:val="0"/>
-          <w:numId w:val="1020"/>
-        </w:numPr>
-        <w:pStyle w:val="Compact"/>
-      </w:pPr>
-      <w:r>
-        <w:t xml:space="preserve">Answer files:</w:t>
-      </w:r>
-      <w:r>
-        <w:t xml:space="preserve"> </w:t>
-      </w:r>
-      <w:r>
-        <w:rPr>
-          <w:rStyle w:val="VerbatimChar"/>
-        </w:rPr>
-        <w:t xml:space="preserve">MediaSanitizationLog.csv</w:t>
-      </w:r>
-      <w:r>
-        <w:t xml:space="preserve">,</w:t>
-      </w:r>
-      <w:r>
-        <w:t xml:space="preserve"> </w:t>
-      </w:r>
-      <w:r>
-        <w:rPr>
-          <w:rStyle w:val="VerbatimChar"/>
-        </w:rPr>
-        <w:t xml:space="preserve">MediaSanitizationCertificate.csv</w:t>
-      </w:r>
-    </w:p>
-    <w:p>
-      <w:pPr>
-        <w:numPr>
-          <w:ilvl w:val="0"/>
-          <w:numId w:val="1020"/>
-        </w:numPr>
-        <w:pStyle w:val="Compact"/>
-      </w:pPr>
-      <w:r>
-        <w:t xml:space="preserve">Windows</w:t>
-      </w:r>
-      <w:r>
-        <w:t xml:space="preserve"> </w:t>
-      </w:r>
-      <w:r>
-        <w:rPr>
-          <w:b/>
-        </w:rPr>
-        <w:t xml:space="preserve">Disk Management</w:t>
-      </w:r>
-      <w:r>
-        <w:t xml:space="preserve"> </w:t>
-      </w:r>
-      <w:r>
-        <w:t xml:space="preserve">(</w:t>
-      </w:r>
-      <w:r>
-        <w:rPr>
-          <w:rStyle w:val="VerbatimChar"/>
-        </w:rPr>
-        <w:t xml:space="preserve">diskmgmt.msc</w:t>
-      </w:r>
-      <w:r>
-        <w:t xml:space="preserve">) or PowerShell</w:t>
-      </w:r>
-    </w:p>
-    <w:p>
-      <w:pPr>
-        <w:pStyle w:val="Heading4"/>
-      </w:pPr>
-      <w:bookmarkStart w:id="51" w:name="steps-1"/>
-      <w:r>
-        <w:t xml:space="preserve">Steps</w:t>
-      </w:r>
-      <w:bookmarkEnd w:id="51"/>
     </w:p>
     <w:p>
       <w:pPr>
@@ -3652,102 +3512,19 @@
           <w:ilvl w:val="0"/>
           <w:numId w:val="1021"/>
         </w:numPr>
-      </w:pPr>
-      <w:r>
-        <w:rPr>
-          <w:b/>
-        </w:rPr>
-        <w:t xml:space="preserve">Understand what "sanitize" means:</w:t>
-      </w:r>
-    </w:p>
-    <w:p>
-      <w:pPr>
-        <w:numPr>
-          <w:ilvl w:val="1"/>
-          <w:numId w:val="1022"/>
-        </w:numPr>
-        <w:pStyle w:val="Compact"/>
-      </w:pPr>
-      <w:r>
-        <w:rPr>
-          <w:b/>
-        </w:rPr>
-        <w:t xml:space="preserve">Clear</w:t>
-      </w:r>
-      <w:r>
-        <w:t xml:space="preserve"> </w:t>
-      </w:r>
-      <w:r>
-        <w:t xml:space="preserve">— overwrite the media so data cannot be recovered with standard tools</w:t>
-      </w:r>
-    </w:p>
-    <w:p>
-      <w:pPr>
-        <w:numPr>
-          <w:ilvl w:val="1"/>
-          <w:numId w:val="1022"/>
-        </w:numPr>
-        <w:pStyle w:val="Compact"/>
-      </w:pPr>
-      <w:r>
-        <w:rPr>
-          <w:b/>
-        </w:rPr>
-        <w:t xml:space="preserve">Purge</w:t>
-      </w:r>
-      <w:r>
-        <w:t xml:space="preserve"> </w:t>
-      </w:r>
-      <w:r>
-        <w:t xml:space="preserve">— a stronger method (e.g., degauss or cryptographic erase) that defeats laboratory recovery</w:t>
-      </w:r>
-    </w:p>
-    <w:p>
-      <w:pPr>
-        <w:numPr>
-          <w:ilvl w:val="1"/>
-          <w:numId w:val="1022"/>
-        </w:numPr>
-        <w:pStyle w:val="Compact"/>
-      </w:pPr>
-      <w:r>
-        <w:rPr>
-          <w:b/>
-        </w:rPr>
-        <w:t xml:space="preserve">Destroy</w:t>
-      </w:r>
-      <w:r>
-        <w:t xml:space="preserve"> </w:t>
-      </w:r>
-      <w:r>
-        <w:t xml:space="preserve">— physically render the media unusable (used when media will not be reused)</w:t>
-      </w:r>
-    </w:p>
-    <w:p>
-      <w:pPr>
-        <w:numPr>
-          <w:ilvl w:val="1"/>
-          <w:numId w:val="1022"/>
-        </w:numPr>
-        <w:pStyle w:val="Compact"/>
-      </w:pPr>
-      <w:r>
-        <w:t xml:space="preserve">Deleting files, emptying the Recycle Bin, and quick-deleting a folder are</w:t>
-      </w:r>
-      <w:r>
-        <w:t xml:space="preserve"> </w:t>
-      </w:r>
-      <w:r>
-        <w:rPr>
-          <w:b/>
-        </w:rPr>
-        <w:t xml:space="preserve">none</w:t>
-      </w:r>
-      <w:r>
-        <w:t xml:space="preserve"> </w:t>
-      </w:r>
-      <w:r>
-        <w:t xml:space="preserve">of these</w:t>
+        <w:pStyle w:val="Compact"/>
+      </w:pPr>
+      <w:r>
+        <w:rPr>
+          <w:rStyle w:val="VerbatimChar"/>
+        </w:rPr>
+        <w:t xml:space="preserve">PXX-FCI-USB-Contents.txt</w:t>
+      </w:r>
+      <w:r>
+        <w:t xml:space="preserve"> </w:t>
+      </w:r>
+      <w:r>
+        <w:t xml:space="preserve">(what is on the media today)</w:t>
       </w:r>
     </w:p>
     <w:p>
@@ -3756,12 +3533,55 @@
           <w:ilvl w:val="0"/>
           <w:numId w:val="1021"/>
         </w:numPr>
-      </w:pPr>
-      <w:r>
-        <w:rPr>
-          <w:b/>
-        </w:rPr>
-        <w:t xml:space="preserve">Confirm what is on the media before you sanitize (evidence for your log):</w:t>
+        <w:pStyle w:val="Compact"/>
+      </w:pPr>
+      <w:r>
+        <w:t xml:space="preserve">Answer files:</w:t>
+      </w:r>
+      <w:r>
+        <w:t xml:space="preserve"> </w:t>
+      </w:r>
+      <w:r>
+        <w:rPr>
+          <w:rStyle w:val="VerbatimChar"/>
+        </w:rPr>
+        <w:t xml:space="preserve">MediaSanitizationLog.csv</w:t>
+      </w:r>
+      <w:r>
+        <w:t xml:space="preserve">,</w:t>
+      </w:r>
+      <w:r>
+        <w:t xml:space="preserve"> </w:t>
+      </w:r>
+      <w:r>
+        <w:rPr>
+          <w:rStyle w:val="VerbatimChar"/>
+        </w:rPr>
+        <w:t xml:space="preserve">MediaSanitizationCertificate.csv</w:t>
+      </w:r>
+    </w:p>
+    <w:p>
+      <w:pPr>
+        <w:pStyle w:val="Heading4"/>
+      </w:pPr>
+      <w:bookmarkStart w:id="49" w:name="steps-1"/>
+      <w:r>
+        <w:t xml:space="preserve">Steps</w:t>
+      </w:r>
+      <w:bookmarkEnd w:id="49"/>
+    </w:p>
+    <w:p>
+      <w:pPr>
+        <w:numPr>
+          <w:ilvl w:val="0"/>
+          <w:numId w:val="1022"/>
+        </w:numPr>
+      </w:pPr>
+      <w:r>
+        <w:rPr>
+          <w:b/>
+        </w:rPr>
+        <w:t xml:space="preserve">Understand what "sanitize" means:</w:t>
       </w:r>
     </w:p>
     <w:p>
@@ -3773,16 +3593,120 @@
         <w:pStyle w:val="Compact"/>
       </w:pPr>
       <w:r>
-        <w:t xml:space="preserve">Mount</w:t>
-      </w:r>
-      <w:r>
-        <w:t xml:space="preserve"> </w:t>
-      </w:r>
-      <w:r>
-        <w:rPr>
-          <w:rStyle w:val="VerbatimChar"/>
-        </w:rPr>
-        <w:t xml:space="preserve">PXX-FCI-USB.vhdx</w:t>
+        <w:rPr>
+          <w:b/>
+        </w:rPr>
+        <w:t xml:space="preserve">Clear</w:t>
+      </w:r>
+      <w:r>
+        <w:t xml:space="preserve"> </w:t>
+      </w:r>
+      <w:r>
+        <w:t xml:space="preserve">— overwrite the media so data cannot be recovered with standard tools</w:t>
+      </w:r>
+    </w:p>
+    <w:p>
+      <w:pPr>
+        <w:numPr>
+          <w:ilvl w:val="1"/>
+          <w:numId w:val="1023"/>
+        </w:numPr>
+        <w:pStyle w:val="Compact"/>
+      </w:pPr>
+      <w:r>
+        <w:rPr>
+          <w:b/>
+        </w:rPr>
+        <w:t xml:space="preserve">Purge</w:t>
+      </w:r>
+      <w:r>
+        <w:t xml:space="preserve"> </w:t>
+      </w:r>
+      <w:r>
+        <w:t xml:space="preserve">— a stronger method (e.g., degauss or cryptographic erase) that defeats laboratory recovery</w:t>
+      </w:r>
+    </w:p>
+    <w:p>
+      <w:pPr>
+        <w:numPr>
+          <w:ilvl w:val="1"/>
+          <w:numId w:val="1023"/>
+        </w:numPr>
+        <w:pStyle w:val="Compact"/>
+      </w:pPr>
+      <w:r>
+        <w:rPr>
+          <w:b/>
+        </w:rPr>
+        <w:t xml:space="preserve">Destroy</w:t>
+      </w:r>
+      <w:r>
+        <w:t xml:space="preserve"> </w:t>
+      </w:r>
+      <w:r>
+        <w:t xml:space="preserve">— physically render the media unusable (used when media will not be reused)</w:t>
+      </w:r>
+    </w:p>
+    <w:p>
+      <w:pPr>
+        <w:numPr>
+          <w:ilvl w:val="1"/>
+          <w:numId w:val="1023"/>
+        </w:numPr>
+        <w:pStyle w:val="Compact"/>
+      </w:pPr>
+      <w:r>
+        <w:t xml:space="preserve">Deleting files, emptying the Recycle Bin, and quick-deleting a folder are</w:t>
+      </w:r>
+      <w:r>
+        <w:t xml:space="preserve"> </w:t>
+      </w:r>
+      <w:r>
+        <w:rPr>
+          <w:b/>
+        </w:rPr>
+        <w:t xml:space="preserve">none</w:t>
+      </w:r>
+      <w:r>
+        <w:t xml:space="preserve"> </w:t>
+      </w:r>
+      <w:r>
+        <w:t xml:space="preserve">of these</w:t>
+      </w:r>
+    </w:p>
+    <w:p>
+      <w:pPr>
+        <w:numPr>
+          <w:ilvl w:val="0"/>
+          <w:numId w:val="1022"/>
+        </w:numPr>
+      </w:pPr>
+      <w:r>
+        <w:rPr>
+          <w:b/>
+        </w:rPr>
+        <w:t xml:space="preserve">Confirm what is on the media before it is sanitized (evidence for your log):</w:t>
+      </w:r>
+    </w:p>
+    <w:p>
+      <w:pPr>
+        <w:numPr>
+          <w:ilvl w:val="1"/>
+          <w:numId w:val="1024"/>
+        </w:numPr>
+        <w:pStyle w:val="Compact"/>
+      </w:pPr>
+      <w:r>
+        <w:t xml:space="preserve">Open</w:t>
+      </w:r>
+      <w:r>
+        <w:t xml:space="preserve"> </w:t>
+      </w:r>
+      <w:r>
+        <w:rPr>
+          <w:rStyle w:val="VerbatimChar"/>
+        </w:rPr>
+        <w:t xml:space="preserve">PXX-FCI-USB-Contents.txt</w:t>
       </w:r>
       <w:r>
         <w:t xml:space="preserve"> </w:t>
@@ -3804,20 +3728,20 @@
       <w:pPr>
         <w:numPr>
           <w:ilvl w:val="0"/>
-          <w:numId w:val="1021"/>
-        </w:numPr>
-      </w:pPr>
-      <w:r>
-        <w:rPr>
-          <w:b/>
-        </w:rPr>
-        <w:t xml:space="preserve">Eject the media, then re-create the volume.</w:t>
-      </w:r>
-      <w:r>
-        <w:t xml:space="preserve"> </w:t>
-      </w:r>
-      <w:r>
-        <w:t xml:space="preserve">The checker verifies that the volume itself was re-created — not merely emptied. Use one of the following.</w:t>
+          <w:numId w:val="1022"/>
+        </w:numPr>
+      </w:pPr>
+      <w:r>
+        <w:rPr>
+          <w:b/>
+        </w:rPr>
+        <w:t xml:space="preserve">How the volume is re-created</w:t>
+      </w:r>
+      <w:r>
+        <w:t xml:space="preserve"> </w:t>
+      </w:r>
+      <w:r>
+        <w:t xml:space="preserve">(reference for this cohort — administrator step, do not attempt): the volume is deleted and a new one created and fully formatted, not merely emptied.</w:t>
       </w:r>
     </w:p>
     <w:p>
@@ -3838,7 +3762,7 @@
       <w:pPr>
         <w:numPr>
           <w:ilvl w:val="1"/>
-          <w:numId w:val="1024"/>
+          <w:numId w:val="1025"/>
         </w:numPr>
         <w:pStyle w:val="Compact"/>
       </w:pPr>
@@ -3874,7 +3798,7 @@
       <w:pPr>
         <w:numPr>
           <w:ilvl w:val="1"/>
-          <w:numId w:val="1024"/>
+          <w:numId w:val="1025"/>
         </w:numPr>
         <w:pStyle w:val="Compact"/>
       </w:pPr>
@@ -3904,7 +3828,7 @@
       <w:pPr>
         <w:numPr>
           <w:ilvl w:val="1"/>
-          <w:numId w:val="1024"/>
+          <w:numId w:val="1025"/>
         </w:numPr>
         <w:pStyle w:val="Compact"/>
       </w:pPr>
@@ -3916,7 +3840,7 @@
       <w:pPr>
         <w:numPr>
           <w:ilvl w:val="1"/>
-          <w:numId w:val="1024"/>
+          <w:numId w:val="1025"/>
         </w:numPr>
         <w:pStyle w:val="Compact"/>
       </w:pPr>
@@ -3943,7 +3867,7 @@
       <w:pPr>
         <w:numPr>
           <w:ilvl w:val="1"/>
-          <w:numId w:val="1024"/>
+          <w:numId w:val="1025"/>
         </w:numPr>
         <w:pStyle w:val="Compact"/>
       </w:pPr>
@@ -3970,7 +3894,7 @@
       <w:pPr>
         <w:numPr>
           <w:ilvl w:val="1"/>
-          <w:numId w:val="1024"/>
+          <w:numId w:val="1025"/>
         </w:numPr>
         <w:pStyle w:val="Compact"/>
       </w:pPr>
@@ -3994,88 +3918,88 @@
       <w:pPr>
         <w:numPr>
           <w:ilvl w:val="2"/>
+          <w:numId w:val="1026"/>
+        </w:numPr>
+        <w:pStyle w:val="Compact"/>
+      </w:pPr>
+      <w:r>
+        <w:t xml:space="preserve">File system:</w:t>
+      </w:r>
+      <w:r>
+        <w:t xml:space="preserve"> </w:t>
+      </w:r>
+      <w:r>
+        <w:rPr>
+          <w:b/>
+        </w:rPr>
+        <w:t xml:space="preserve">NTFS</w:t>
+      </w:r>
+    </w:p>
+    <w:p>
+      <w:pPr>
+        <w:numPr>
+          <w:ilvl w:val="2"/>
+          <w:numId w:val="1026"/>
+        </w:numPr>
+        <w:pStyle w:val="Compact"/>
+      </w:pPr>
+      <w:r>
+        <w:t xml:space="preserve">Volume label:</w:t>
+      </w:r>
+      <w:r>
+        <w:t xml:space="preserve"> </w:t>
+      </w:r>
+      <w:r>
+        <w:rPr>
+          <w:b/>
+        </w:rPr>
+        <w:t xml:space="preserve">PXX-SANITIZED</w:t>
+      </w:r>
+      <w:r>
+        <w:t xml:space="preserve"> </w:t>
+      </w:r>
+      <w:r>
+        <w:t xml:space="preserve">(exactly this, with your pod prefix)</w:t>
+      </w:r>
+    </w:p>
+    <w:p>
+      <w:pPr>
+        <w:numPr>
+          <w:ilvl w:val="2"/>
+          <w:numId w:val="1026"/>
+        </w:numPr>
+        <w:pStyle w:val="Compact"/>
+      </w:pPr>
+      <w:r>
+        <w:rPr>
+          <w:b/>
+        </w:rPr>
+        <w:t xml:space="preserve">Uncheck</w:t>
+      </w:r>
+      <w:r>
+        <w:t xml:space="preserve"> </w:t>
+      </w:r>
+      <w:r>
+        <w:t xml:space="preserve">"Perform a quick format" (a full format overwrites the data area)</w:t>
+      </w:r>
+    </w:p>
+    <w:p>
+      <w:pPr>
+        <w:numPr>
+          <w:ilvl w:val="1"/>
           <w:numId w:val="1025"/>
         </w:numPr>
         <w:pStyle w:val="Compact"/>
       </w:pPr>
       <w:r>
-        <w:t xml:space="preserve">File system:</w:t>
-      </w:r>
-      <w:r>
-        <w:t xml:space="preserve"> </w:t>
-      </w:r>
-      <w:r>
-        <w:rPr>
-          <w:b/>
-        </w:rPr>
-        <w:t xml:space="preserve">NTFS</w:t>
-      </w:r>
-    </w:p>
-    <w:p>
-      <w:pPr>
-        <w:numPr>
-          <w:ilvl w:val="2"/>
+        <w:t xml:space="preserve">Finish and wait for the format to complete</w:t>
+      </w:r>
+    </w:p>
+    <w:p>
+      <w:pPr>
+        <w:numPr>
+          <w:ilvl w:val="1"/>
           <w:numId w:val="1025"/>
-        </w:numPr>
-        <w:pStyle w:val="Compact"/>
-      </w:pPr>
-      <w:r>
-        <w:t xml:space="preserve">Volume label:</w:t>
-      </w:r>
-      <w:r>
-        <w:t xml:space="preserve"> </w:t>
-      </w:r>
-      <w:r>
-        <w:rPr>
-          <w:b/>
-        </w:rPr>
-        <w:t xml:space="preserve">PXX-SANITIZED</w:t>
-      </w:r>
-      <w:r>
-        <w:t xml:space="preserve"> </w:t>
-      </w:r>
-      <w:r>
-        <w:t xml:space="preserve">(exactly this, with your pod prefix)</w:t>
-      </w:r>
-    </w:p>
-    <w:p>
-      <w:pPr>
-        <w:numPr>
-          <w:ilvl w:val="2"/>
-          <w:numId w:val="1025"/>
-        </w:numPr>
-        <w:pStyle w:val="Compact"/>
-      </w:pPr>
-      <w:r>
-        <w:rPr>
-          <w:b/>
-        </w:rPr>
-        <w:t xml:space="preserve">Uncheck</w:t>
-      </w:r>
-      <w:r>
-        <w:t xml:space="preserve"> </w:t>
-      </w:r>
-      <w:r>
-        <w:t xml:space="preserve">"Perform a quick format" (a full format overwrites the data area)</w:t>
-      </w:r>
-    </w:p>
-    <w:p>
-      <w:pPr>
-        <w:numPr>
-          <w:ilvl w:val="1"/>
-          <w:numId w:val="1024"/>
-        </w:numPr>
-        <w:pStyle w:val="Compact"/>
-      </w:pPr>
-      <w:r>
-        <w:t xml:space="preserve">Finish and wait for the format to complete</w:t>
-      </w:r>
-    </w:p>
-    <w:p>
-      <w:pPr>
-        <w:numPr>
-          <w:ilvl w:val="1"/>
-          <w:numId w:val="1024"/>
         </w:numPr>
         <w:pStyle w:val="Compact"/>
       </w:pPr>
@@ -4490,26 +4414,20 @@
       <w:pPr>
         <w:numPr>
           <w:ilvl w:val="0"/>
-          <w:numId w:val="1021"/>
-        </w:numPr>
-      </w:pPr>
-      <w:r>
-        <w:rPr>
-          <w:b/>
-        </w:rPr>
-        <w:t xml:space="preserve">Validate your work before writing the paperwork:</w:t>
-      </w:r>
-    </w:p>
-    <w:p>
-      <w:pPr>
-        <w:numPr>
-          <w:ilvl w:val="1"/>
-          <w:numId w:val="1026"/>
-        </w:numPr>
-        <w:pStyle w:val="Compact"/>
-      </w:pPr>
-      <w:r>
-        <w:t xml:space="preserve">Re-mount the media and confirm the label reads</w:t>
+          <w:numId w:val="1022"/>
+        </w:numPr>
+      </w:pPr>
+      <w:r>
+        <w:rPr>
+          <w:b/>
+        </w:rPr>
+        <w:t xml:space="preserve">Validation</w:t>
+      </w:r>
+      <w:r>
+        <w:t xml:space="preserve"> </w:t>
+      </w:r>
+      <w:r>
+        <w:t xml:space="preserve">(performed with the sanitization): the label reads</w:t>
       </w:r>
       <w:r>
         <w:t xml:space="preserve"> </w:t>
@@ -4520,17 +4438,11 @@
         </w:rPr>
         <w:t xml:space="preserve">PXX-SANITIZED</w:t>
       </w:r>
-    </w:p>
-    <w:p>
-      <w:pPr>
-        <w:numPr>
-          <w:ilvl w:val="1"/>
-          <w:numId w:val="1026"/>
-        </w:numPr>
-        <w:pStyle w:val="Compact"/>
-      </w:pPr>
-      <w:r>
-        <w:t xml:space="preserve">Confirm the volume is empty —</w:t>
+      <w:r>
+        <w:t xml:space="preserve"> </w:t>
+      </w:r>
+      <w:r>
+        <w:t xml:space="preserve">and the volume is empty apart from</w:t>
       </w:r>
       <w:r>
         <w:t xml:space="preserve"> </w:t>
@@ -4557,29 +4469,14 @@
         <w:t xml:space="preserve">$RECYCLE.BIN</w:t>
       </w:r>
       <w:r>
-        <w:t xml:space="preserve"> </w:t>
-      </w:r>
-      <w:r>
-        <w:t xml:space="preserve">are the only things allowed</w:t>
-      </w:r>
-    </w:p>
-    <w:p>
-      <w:pPr>
-        <w:numPr>
-          <w:ilvl w:val="1"/>
-          <w:numId w:val="1026"/>
-        </w:numPr>
-        <w:pStyle w:val="Compact"/>
-      </w:pPr>
-      <w:r>
-        <w:t xml:space="preserve">Eject the media</w:t>
+        <w:t xml:space="preserve">.</w:t>
       </w:r>
     </w:p>
     <w:p>
       <w:pPr>
         <w:numPr>
           <w:ilvl w:val="0"/>
-          <w:numId w:val="1021"/>
+          <w:numId w:val="1022"/>
         </w:numPr>
       </w:pPr>
       <w:r>
@@ -4792,7 +4689,7 @@
               <w:t xml:space="preserve"> </w:t>
             </w:r>
             <w:r>
-              <w:t xml:space="preserve">(the method you actually performed)</w:t>
+              <w:t xml:space="preserve">(the method used on this media)</w:t>
             </w:r>
           </w:p>
         </w:tc>
@@ -4956,7 +4853,7 @@
               <w:jc w:val="left"/>
             </w:pPr>
             <w:r>
-              <w:t xml:space="preserve">The date you performed it, e.g.,</w:t>
+              <w:t xml:space="preserve">The date the sanitization was performed, e.g.,</w:t>
             </w:r>
             <w:r>
               <w:t xml:space="preserve"> </w:t>
@@ -4975,11 +4872,11 @@
       <w:pPr>
         <w:pStyle w:val="Heading4"/>
       </w:pPr>
-      <w:bookmarkStart w:id="52" w:name="completion-criteria-1"/>
+      <w:bookmarkStart w:id="50" w:name="completion-criteria-1"/>
       <w:r>
         <w:t xml:space="preserve">Completion Criteria</w:t>
       </w:r>
-      <w:bookmarkEnd w:id="52"/>
+      <w:bookmarkEnd w:id="50"/>
     </w:p>
     <w:p>
       <w:pPr>
@@ -4990,22 +4887,103 @@
         <w:pStyle w:val="Compact"/>
       </w:pPr>
       <w:r>
-        <w:t xml:space="preserve">☐ The volume was</w:t>
-      </w:r>
-      <w:r>
-        <w:t xml:space="preserve"> </w:t>
-      </w:r>
-      <w:r>
-        <w:rPr>
-          <w:b/>
-        </w:rPr>
-        <w:t xml:space="preserve">deleted and re-created</w:t>
-      </w:r>
-      <w:r>
-        <w:t xml:space="preserve"> </w:t>
-      </w:r>
-      <w:r>
-        <w:t xml:space="preserve">(not just emptied)</w:t>
+        <w:t xml:space="preserve">☐ Sanitization</w:t>
+      </w:r>
+      <w:r>
+        <w:t xml:space="preserve"> </w:t>
+      </w:r>
+      <w:r>
+        <w:rPr>
+          <w:b/>
+        </w:rPr>
+        <w:t xml:space="preserve">log</w:t>
+      </w:r>
+      <w:r>
+        <w:t xml:space="preserve"> </w:t>
+      </w:r>
+      <w:r>
+        <w:t xml:space="preserve">and</w:t>
+      </w:r>
+      <w:r>
+        <w:t xml:space="preserve"> </w:t>
+      </w:r>
+      <w:r>
+        <w:rPr>
+          <w:b/>
+        </w:rPr>
+        <w:t xml:space="preserve">certificate</w:t>
+      </w:r>
+      <w:r>
+        <w:t xml:space="preserve"> </w:t>
+      </w:r>
+      <w:r>
+        <w:t xml:space="preserve">both record</w:t>
+      </w:r>
+      <w:r>
+        <w:t xml:space="preserve"> </w:t>
+      </w:r>
+      <w:r>
+        <w:rPr>
+          <w:rStyle w:val="VerbatimChar"/>
+        </w:rPr>
+        <w:t xml:space="preserve">Clear</w:t>
+      </w:r>
+      <w:r>
+        <w:t xml:space="preserve"> </w:t>
+      </w:r>
+      <w:r>
+        <w:t xml:space="preserve">or</w:t>
+      </w:r>
+      <w:r>
+        <w:t xml:space="preserve"> </w:t>
+      </w:r>
+      <w:r>
+        <w:rPr>
+          <w:rStyle w:val="VerbatimChar"/>
+        </w:rPr>
+        <w:t xml:space="preserve">Purge</w:t>
+      </w:r>
+      <w:r>
+        <w:t xml:space="preserve">,</w:t>
+      </w:r>
+      <w:r>
+        <w:t xml:space="preserve"> </w:t>
+      </w:r>
+      <w:r>
+        <w:rPr>
+          <w:rStyle w:val="VerbatimChar"/>
+        </w:rPr>
+        <w:t xml:space="preserve">Pass</w:t>
+      </w:r>
+      <w:r>
+        <w:t xml:space="preserve">,</w:t>
+      </w:r>
+      <w:r>
+        <w:t xml:space="preserve"> </w:t>
+      </w:r>
+      <w:r>
+        <w:rPr>
+          <w:rStyle w:val="VerbatimChar"/>
+        </w:rPr>
+        <w:t xml:space="preserve">Reuse</w:t>
+      </w:r>
+      <w:r>
+        <w:t xml:space="preserve">, a</w:t>
+      </w:r>
+      <w:r>
+        <w:t xml:space="preserve"> </w:t>
+      </w:r>
+      <w:r>
+        <w:rPr>
+          <w:rStyle w:val="VerbatimChar"/>
+        </w:rPr>
+        <w:t xml:space="preserve">SanitizedBy</w:t>
+      </w:r>
+      <w:r>
+        <w:t xml:space="preserve"> </w:t>
+      </w:r>
+      <w:r>
+        <w:t xml:space="preserve">name, and a valid date</w:t>
       </w:r>
     </w:p>
     <w:p>
@@ -5017,147 +4995,6 @@
         <w:pStyle w:val="Compact"/>
       </w:pPr>
       <w:r>
-        <w:t xml:space="preserve">☐ Volume label is exactly</w:t>
-      </w:r>
-      <w:r>
-        <w:t xml:space="preserve"> </w:t>
-      </w:r>
-      <w:r>
-        <w:rPr>
-          <w:rStyle w:val="VerbatimChar"/>
-        </w:rPr>
-        <w:t xml:space="preserve">PXX-SANITIZED</w:t>
-      </w:r>
-    </w:p>
-    <w:p>
-      <w:pPr>
-        <w:numPr>
-          <w:ilvl w:val="0"/>
-          <w:numId w:val="1027"/>
-        </w:numPr>
-        <w:pStyle w:val="Compact"/>
-      </w:pPr>
-      <w:r>
-        <w:t xml:space="preserve">☐ The volume contains no files or folders</w:t>
-      </w:r>
-    </w:p>
-    <w:p>
-      <w:pPr>
-        <w:numPr>
-          <w:ilvl w:val="0"/>
-          <w:numId w:val="1027"/>
-        </w:numPr>
-        <w:pStyle w:val="Compact"/>
-      </w:pPr>
-      <w:r>
-        <w:t xml:space="preserve">☐ Sanitization</w:t>
-      </w:r>
-      <w:r>
-        <w:t xml:space="preserve"> </w:t>
-      </w:r>
-      <w:r>
-        <w:rPr>
-          <w:b/>
-        </w:rPr>
-        <w:t xml:space="preserve">log</w:t>
-      </w:r>
-      <w:r>
-        <w:t xml:space="preserve"> </w:t>
-      </w:r>
-      <w:r>
-        <w:t xml:space="preserve">and</w:t>
-      </w:r>
-      <w:r>
-        <w:t xml:space="preserve"> </w:t>
-      </w:r>
-      <w:r>
-        <w:rPr>
-          <w:b/>
-        </w:rPr>
-        <w:t xml:space="preserve">certificate</w:t>
-      </w:r>
-      <w:r>
-        <w:t xml:space="preserve"> </w:t>
-      </w:r>
-      <w:r>
-        <w:t xml:space="preserve">both record</w:t>
-      </w:r>
-      <w:r>
-        <w:t xml:space="preserve"> </w:t>
-      </w:r>
-      <w:r>
-        <w:rPr>
-          <w:rStyle w:val="VerbatimChar"/>
-        </w:rPr>
-        <w:t xml:space="preserve">Clear</w:t>
-      </w:r>
-      <w:r>
-        <w:t xml:space="preserve"> </w:t>
-      </w:r>
-      <w:r>
-        <w:t xml:space="preserve">or</w:t>
-      </w:r>
-      <w:r>
-        <w:t xml:space="preserve"> </w:t>
-      </w:r>
-      <w:r>
-        <w:rPr>
-          <w:rStyle w:val="VerbatimChar"/>
-        </w:rPr>
-        <w:t xml:space="preserve">Purge</w:t>
-      </w:r>
-      <w:r>
-        <w:t xml:space="preserve">,</w:t>
-      </w:r>
-      <w:r>
-        <w:t xml:space="preserve"> </w:t>
-      </w:r>
-      <w:r>
-        <w:rPr>
-          <w:rStyle w:val="VerbatimChar"/>
-        </w:rPr>
-        <w:t xml:space="preserve">Pass</w:t>
-      </w:r>
-      <w:r>
-        <w:t xml:space="preserve">,</w:t>
-      </w:r>
-      <w:r>
-        <w:t xml:space="preserve"> </w:t>
-      </w:r>
-      <w:r>
-        <w:rPr>
-          <w:rStyle w:val="VerbatimChar"/>
-        </w:rPr>
-        <w:t xml:space="preserve">Reuse</w:t>
-      </w:r>
-      <w:r>
-        <w:t xml:space="preserve">, a</w:t>
-      </w:r>
-      <w:r>
-        <w:t xml:space="preserve"> </w:t>
-      </w:r>
-      <w:r>
-        <w:rPr>
-          <w:rStyle w:val="VerbatimChar"/>
-        </w:rPr>
-        <w:t xml:space="preserve">SanitizedBy</w:t>
-      </w:r>
-      <w:r>
-        <w:t xml:space="preserve"> </w:t>
-      </w:r>
-      <w:r>
-        <w:t xml:space="preserve">name, and a valid date</w:t>
-      </w:r>
-    </w:p>
-    <w:p>
-      <w:pPr>
-        <w:numPr>
-          <w:ilvl w:val="0"/>
-          <w:numId w:val="1027"/>
-        </w:numPr>
-        <w:pStyle w:val="Compact"/>
-      </w:pPr>
-      <w:r>
         <w:t xml:space="preserve">☐</w:t>
       </w:r>
       <w:r>
@@ -5178,42 +5015,13 @@
     </w:p>
     <w:p>
       <w:pPr>
-        <w:pStyle w:val="BlockText"/>
-      </w:pPr>
-      <w:r>
-        <w:rPr>
-          <w:b/>
-        </w:rPr>
-        <w:t xml:space="preserve">Hint:</w:t>
-      </w:r>
-      <w:r>
-        <w:t xml:space="preserve"> </w:t>
-      </w:r>
-      <w:r>
-        <w:t xml:space="preserve">If the checker says</w:t>
-      </w:r>
-      <w:r>
-        <w:t xml:space="preserve"> </w:t>
-      </w:r>
-      <w:r>
-        <w:rPr>
-          <w:i/>
-        </w:rPr>
-        <w:t xml:space="preserve">"volume identity is unchanged; recreate and format the volume rather than deleting files"</w:t>
-      </w:r>
-      <w:r>
-        <w:t xml:space="preserve">, you emptied the drive instead of re-creating the volume. Repeat step 3.</w:t>
-      </w:r>
-    </w:p>
-    <w:p>
-      <w:pPr>
         <w:pStyle w:val="Heading4"/>
       </w:pPr>
-      <w:bookmarkStart w:id="53" w:name="why-this-matters-1"/>
+      <w:bookmarkStart w:id="51" w:name="why-this-matters-1"/>
       <w:r>
         <w:t xml:space="preserve">Why This Matters</w:t>
       </w:r>
-      <w:bookmarkEnd w:id="53"/>
+      <w:bookmarkEnd w:id="51"/>
     </w:p>
     <w:p>
       <w:pPr>
@@ -5249,101 +5057,101 @@
       <w:pPr>
         <w:pStyle w:val="Heading3"/>
       </w:pPr>
-      <w:bookmarkStart w:id="54" w:name="lab-m1-l3-decide-the-disposition"/>
+      <w:bookmarkStart w:id="52" w:name="lab-m1-l3-decide-the-disposition"/>
       <w:r>
         <w:t xml:space="preserve">Lab M1-L3: Decide the Disposition</w:t>
       </w:r>
+      <w:bookmarkEnd w:id="52"/>
+    </w:p>
+    <w:p>
+      <w:pPr>
+        <w:pStyle w:val="FirstParagraph"/>
+      </w:pPr>
+      <w:r>
+        <w:rPr>
+          <w:b/>
+        </w:rPr>
+        <w:t xml:space="preserve">Difficulty:</w:t>
+      </w:r>
+      <w:r>
+        <w:t xml:space="preserve"> </w:t>
+      </w:r>
+      <w:r>
+        <w:t xml:space="preserve">Intermediate |</w:t>
+      </w:r>
+      <w:r>
+        <w:t xml:space="preserve"> </w:t>
+      </w:r>
+      <w:r>
+        <w:rPr>
+          <w:b/>
+        </w:rPr>
+        <w:t xml:space="preserve">Time:</w:t>
+      </w:r>
+      <w:r>
+        <w:t xml:space="preserve"> </w:t>
+      </w:r>
+      <w:r>
+        <w:t xml:space="preserve">25 minutes |</w:t>
+      </w:r>
+      <w:r>
+        <w:t xml:space="preserve"> </w:t>
+      </w:r>
+      <w:r>
+        <w:rPr>
+          <w:b/>
+        </w:rPr>
+        <w:t xml:space="preserve">Type:</w:t>
+      </w:r>
+      <w:r>
+        <w:t xml:space="preserve"> </w:t>
+      </w:r>
+      <w:r>
+        <w:t xml:space="preserve">Document analysis + worksheet</w:t>
+      </w:r>
+    </w:p>
+    <w:p>
+      <w:pPr>
+        <w:pStyle w:val="Heading4"/>
+      </w:pPr>
+      <w:bookmarkStart w:id="53" w:name="scenario-2"/>
+      <w:r>
+        <w:t xml:space="preserve">Scenario</w:t>
+      </w:r>
+      <w:bookmarkEnd w:id="53"/>
+    </w:p>
+    <w:p>
+      <w:pPr>
+        <w:pStyle w:val="FirstParagraph"/>
+      </w:pPr>
+      <w:r>
+        <w:t xml:space="preserve">Laptop</w:t>
+      </w:r>
+      <w:r>
+        <w:t xml:space="preserve"> </w:t>
+      </w:r>
+      <w:r>
+        <w:rPr>
+          <w:rStyle w:val="VerbatimChar"/>
+        </w:rPr>
+        <w:t xml:space="preserve">PXX-LAP-017</w:t>
+      </w:r>
+      <w:r>
+        <w:t xml:space="preserve"> </w:t>
+      </w:r>
+      <w:r>
+        <w:t xml:space="preserve">from the Federal Programs group has failed diagnostics and reached end of life. Its drive held FCI. Facilities has already sent it out with a chain-of-custody record, and the vendor returned a certificate. Your job is to record the correct disposition decision and prove that the paperwork lines up.</w:t>
+      </w:r>
+    </w:p>
+    <w:p>
+      <w:pPr>
+        <w:pStyle w:val="Heading4"/>
+      </w:pPr>
+      <w:bookmarkStart w:id="54" w:name="what-you-need-3"/>
+      <w:r>
+        <w:t xml:space="preserve">What You Need</w:t>
+      </w:r>
       <w:bookmarkEnd w:id="54"/>
-    </w:p>
-    <w:p>
-      <w:pPr>
-        <w:pStyle w:val="FirstParagraph"/>
-      </w:pPr>
-      <w:r>
-        <w:rPr>
-          <w:b/>
-        </w:rPr>
-        <w:t xml:space="preserve">Difficulty:</w:t>
-      </w:r>
-      <w:r>
-        <w:t xml:space="preserve"> </w:t>
-      </w:r>
-      <w:r>
-        <w:t xml:space="preserve">Intermediate |</w:t>
-      </w:r>
-      <w:r>
-        <w:t xml:space="preserve"> </w:t>
-      </w:r>
-      <w:r>
-        <w:rPr>
-          <w:b/>
-        </w:rPr>
-        <w:t xml:space="preserve">Time:</w:t>
-      </w:r>
-      <w:r>
-        <w:t xml:space="preserve"> </w:t>
-      </w:r>
-      <w:r>
-        <w:t xml:space="preserve">25 minutes |</w:t>
-      </w:r>
-      <w:r>
-        <w:t xml:space="preserve"> </w:t>
-      </w:r>
-      <w:r>
-        <w:rPr>
-          <w:b/>
-        </w:rPr>
-        <w:t xml:space="preserve">Type:</w:t>
-      </w:r>
-      <w:r>
-        <w:t xml:space="preserve"> </w:t>
-      </w:r>
-      <w:r>
-        <w:t xml:space="preserve">Document analysis + worksheet</w:t>
-      </w:r>
-    </w:p>
-    <w:p>
-      <w:pPr>
-        <w:pStyle w:val="Heading4"/>
-      </w:pPr>
-      <w:bookmarkStart w:id="55" w:name="scenario-2"/>
-      <w:r>
-        <w:t xml:space="preserve">Scenario</w:t>
-      </w:r>
-      <w:bookmarkEnd w:id="55"/>
-    </w:p>
-    <w:p>
-      <w:pPr>
-        <w:pStyle w:val="FirstParagraph"/>
-      </w:pPr>
-      <w:r>
-        <w:t xml:space="preserve">Laptop</w:t>
-      </w:r>
-      <w:r>
-        <w:t xml:space="preserve"> </w:t>
-      </w:r>
-      <w:r>
-        <w:rPr>
-          <w:rStyle w:val="VerbatimChar"/>
-        </w:rPr>
-        <w:t xml:space="preserve">PXX-LAP-017</w:t>
-      </w:r>
-      <w:r>
-        <w:t xml:space="preserve"> </w:t>
-      </w:r>
-      <w:r>
-        <w:t xml:space="preserve">from the Federal Programs group has failed diagnostics and reached end of life. Its drive held FCI. Facilities has already sent it out with a chain-of-custody record, and the vendor returned a certificate. Your job is to record the correct disposition decision and prove that the paperwork lines up.</w:t>
-      </w:r>
-    </w:p>
-    <w:p>
-      <w:pPr>
-        <w:pStyle w:val="Heading4"/>
-      </w:pPr>
-      <w:bookmarkStart w:id="56" w:name="what-you-need-3"/>
-      <w:r>
-        <w:t xml:space="preserve">What You Need</w:t>
-      </w:r>
-      <w:bookmarkEnd w:id="56"/>
     </w:p>
     <w:p>
       <w:pPr>
@@ -5415,11 +5223,11 @@
       <w:pPr>
         <w:pStyle w:val="Heading4"/>
       </w:pPr>
-      <w:bookmarkStart w:id="57" w:name="steps-2"/>
+      <w:bookmarkStart w:id="55" w:name="steps-2"/>
       <w:r>
         <w:t xml:space="preserve">Steps</w:t>
       </w:r>
-      <w:bookmarkEnd w:id="57"/>
+      <w:bookmarkEnd w:id="55"/>
     </w:p>
     <w:p>
       <w:pPr>
@@ -6155,11 +5963,11 @@
       <w:pPr>
         <w:pStyle w:val="Heading4"/>
       </w:pPr>
-      <w:bookmarkStart w:id="58" w:name="completion-criteria-2"/>
+      <w:bookmarkStart w:id="56" w:name="completion-criteria-2"/>
       <w:r>
         <w:t xml:space="preserve">Completion Criteria</w:t>
       </w:r>
-      <w:bookmarkEnd w:id="58"/>
+      <w:bookmarkEnd w:id="56"/>
     </w:p>
     <w:p>
       <w:pPr>
@@ -6282,11 +6090,11 @@
       <w:pPr>
         <w:pStyle w:val="Heading4"/>
       </w:pPr>
-      <w:bookmarkStart w:id="59" w:name="why-this-matters-2"/>
+      <w:bookmarkStart w:id="57" w:name="why-this-matters-2"/>
       <w:r>
         <w:t xml:space="preserve">Why This Matters</w:t>
       </w:r>
-      <w:bookmarkEnd w:id="59"/>
+      <w:bookmarkEnd w:id="57"/>
     </w:p>
     <w:p>
       <w:pPr>
@@ -6307,11 +6115,11 @@
       <w:pPr>
         <w:pStyle w:val="Heading2"/>
       </w:pPr>
-      <w:bookmarkStart w:id="60" w:name="quick-reference-where-to-find-things"/>
+      <w:bookmarkStart w:id="58" w:name="quick-reference-where-to-find-things"/>
       <w:r>
         <w:t xml:space="preserve">Quick Reference: Where to Find Things</w:t>
       </w:r>
-      <w:bookmarkEnd w:id="60"/>
+      <w:bookmarkEnd w:id="58"/>
     </w:p>
     <w:tbl>
       <w:tblPr>
@@ -6395,18 +6203,18 @@
               <w:jc w:val="left"/>
             </w:pPr>
             <w:r>
-              <w:t xml:space="preserve">Mount simulated media</w:t>
-            </w:r>
-          </w:p>
-        </w:tc>
-        <w:tc>
-          <w:p>
-            <w:pPr>
-              <w:pStyle w:val="Compact"/>
-              <w:jc w:val="left"/>
-            </w:pPr>
-            <w:r>
-              <w:t xml:space="preserve">Double-click the</w:t>
+              <w:t xml:space="preserve">Read what is on simulated media</w:t>
+            </w:r>
+          </w:p>
+        </w:tc>
+        <w:tc>
+          <w:p>
+            <w:pPr>
+              <w:pStyle w:val="Compact"/>
+              <w:jc w:val="left"/>
+            </w:pPr>
+            <w:r>
+              <w:t xml:space="preserve">Open</w:t>
             </w:r>
             <w:r>
               <w:t xml:space="preserve"> </w:t>
@@ -6415,19 +6223,13 @@
               <w:rPr>
                 <w:rStyle w:val="VerbatimChar"/>
               </w:rPr>
-              <w:t xml:space="preserve">.vhdx</w:t>
-            </w:r>
-            <w:r>
-              <w:t xml:space="preserve">, or</w:t>
+              <w:t xml:space="preserve">PXX-&lt;name&gt;-Contents.txt</w:t>
             </w:r>
             <w:r>
               <w:t xml:space="preserve"> </w:t>
             </w:r>
             <w:r>
-              <w:rPr>
-                <w:b/>
-              </w:rPr>
-              <w:t xml:space="preserve">Disk Management → Action → Attach VHD</w:t>
+              <w:t xml:space="preserve">in the artifacts folder</w:t>
             </w:r>
           </w:p>
         </w:tc>
@@ -6440,100 +6242,7 @@
               <w:jc w:val="left"/>
             </w:pPr>
             <w:r>
-              <w:t xml:space="preserve">Eject simulated media</w:t>
-            </w:r>
-          </w:p>
-        </w:tc>
-        <w:tc>
-          <w:p>
-            <w:pPr>
-              <w:pStyle w:val="Compact"/>
-              <w:jc w:val="left"/>
-            </w:pPr>
-            <w:r>
-              <w:t xml:space="preserve">Right-click drive →</w:t>
-            </w:r>
-            <w:r>
-              <w:t xml:space="preserve"> </w:t>
-            </w:r>
-            <w:r>
-              <w:rPr>
-                <w:b/>
-              </w:rPr>
-              <w:t xml:space="preserve">Eject</w:t>
-            </w:r>
-            <w:r>
-              <w:t xml:space="preserve">, or</w:t>
-            </w:r>
-            <w:r>
-              <w:t xml:space="preserve"> </w:t>
-            </w:r>
-            <w:r>
-              <w:rPr>
-                <w:b/>
-              </w:rPr>
-              <w:t xml:space="preserve">Detach VHD</w:t>
-            </w:r>
-          </w:p>
-        </w:tc>
-      </w:tr>
-      <w:tr>
-        <w:tc>
-          <w:p>
-            <w:pPr>
-              <w:pStyle w:val="Compact"/>
-              <w:jc w:val="left"/>
-            </w:pPr>
-            <w:r>
-              <w:t xml:space="preserve">Show hidden files</w:t>
-            </w:r>
-          </w:p>
-        </w:tc>
-        <w:tc>
-          <w:p>
-            <w:pPr>
-              <w:pStyle w:val="Compact"/>
-              <w:jc w:val="left"/>
-            </w:pPr>
-            <w:r>
-              <w:t xml:space="preserve">File Explorer →</w:t>
-            </w:r>
-            <w:r>
-              <w:t xml:space="preserve"> </w:t>
-            </w:r>
-            <w:r>
-              <w:rPr>
-                <w:b/>
-              </w:rPr>
-              <w:t xml:space="preserve">View</w:t>
-            </w:r>
-            <w:r>
-              <w:t xml:space="preserve"> </w:t>
-            </w:r>
-            <w:r>
-              <w:t xml:space="preserve">→</w:t>
-            </w:r>
-            <w:r>
-              <w:t xml:space="preserve"> </w:t>
-            </w:r>
-            <w:r>
-              <w:rPr>
-                <w:b/>
-              </w:rPr>
-              <w:t xml:space="preserve">Hidden items</w:t>
-            </w:r>
-          </w:p>
-        </w:tc>
-      </w:tr>
-      <w:tr>
-        <w:tc>
-          <w:p>
-            <w:pPr>
-              <w:pStyle w:val="Compact"/>
-              <w:jc w:val="left"/>
-            </w:pPr>
-            <w:r>
-              <w:t xml:space="preserve">Delete/create/format a volume</w:t>
+              <w:t xml:space="preserve">Open PowerShell</w:t>
             </w:r>
           </w:p>
         </w:tc>
@@ -6562,91 +6271,7 @@
               <w:rPr>
                 <w:rStyle w:val="VerbatimChar"/>
               </w:rPr>
-              <w:t xml:space="preserve">diskmgmt.msc</w:t>
-            </w:r>
-          </w:p>
-        </w:tc>
-      </w:tr>
-      <w:tr>
-        <w:tc>
-          <w:p>
-            <w:pPr>
-              <w:pStyle w:val="Compact"/>
-              <w:jc w:val="left"/>
-            </w:pPr>
-            <w:r>
-              <w:t xml:space="preserve">Open PowerShell</w:t>
-            </w:r>
-          </w:p>
-        </w:tc>
-        <w:tc>
-          <w:p>
-            <w:pPr>
-              <w:pStyle w:val="Compact"/>
-              <w:jc w:val="left"/>
-            </w:pPr>
-            <w:r>
-              <w:rPr>
-                <w:b/>
-              </w:rPr>
-              <w:t xml:space="preserve">Windows + R</w:t>
-            </w:r>
-            <w:r>
-              <w:t xml:space="preserve"> </w:t>
-            </w:r>
-            <w:r>
-              <w:t xml:space="preserve">→</w:t>
-            </w:r>
-            <w:r>
-              <w:t xml:space="preserve"> </w:t>
-            </w:r>
-            <w:r>
-              <w:rPr>
-                <w:rStyle w:val="VerbatimChar"/>
-              </w:rPr>
               <w:t xml:space="preserve">powershell</w:t>
-            </w:r>
-          </w:p>
-        </w:tc>
-      </w:tr>
-      <w:tr>
-        <w:tc>
-          <w:p>
-            <w:pPr>
-              <w:pStyle w:val="Compact"/>
-              <w:jc w:val="left"/>
-            </w:pPr>
-            <w:r>
-              <w:t xml:space="preserve">Check volume label and contents</w:t>
-            </w:r>
-          </w:p>
-        </w:tc>
-        <w:tc>
-          <w:p>
-            <w:pPr>
-              <w:pStyle w:val="Compact"/>
-              <w:jc w:val="left"/>
-            </w:pPr>
-            <w:r>
-              <w:rPr>
-                <w:rStyle w:val="VerbatimChar"/>
-              </w:rPr>
-              <w:t xml:space="preserve">Get-Volume</w:t>
-            </w:r>
-            <w:r>
-              <w:t xml:space="preserve"> </w:t>
-            </w:r>
-            <w:r>
-              <w:t xml:space="preserve">/</w:t>
-            </w:r>
-            <w:r>
-              <w:t xml:space="preserve"> </w:t>
-            </w:r>
-            <w:r>
-              <w:rPr>
-                <w:rStyle w:val="VerbatimChar"/>
-              </w:rPr>
-              <w:t xml:space="preserve">Get-ChildItem -Force</w:t>
             </w:r>
           </w:p>
         </w:tc>
@@ -6685,11 +6310,11 @@
       <w:pPr>
         <w:pStyle w:val="Heading3"/>
       </w:pPr>
-      <w:bookmarkStart w:id="61" w:name="media-handling-terms"/>
+      <w:bookmarkStart w:id="59" w:name="media-handling-terms"/>
       <w:r>
         <w:t xml:space="preserve">Media Handling Terms</w:t>
       </w:r>
-      <w:bookmarkEnd w:id="61"/>
+      <w:bookmarkEnd w:id="59"/>
     </w:p>
     <w:tbl>
       <w:tblPr>
@@ -6885,11 +6510,11 @@
       <w:pPr>
         <w:pStyle w:val="Heading2"/>
       </w:pPr>
-      <w:bookmarkStart w:id="62" w:name="tips-and-common-mistakes"/>
+      <w:bookmarkStart w:id="60" w:name="tips-and-common-mistakes"/>
       <w:r>
         <w:t xml:space="preserve">Tips and Common Mistakes</w:t>
       </w:r>
-      <w:bookmarkEnd w:id="62"/>
+      <w:bookmarkEnd w:id="60"/>
     </w:p>
     <w:tbl>
       <w:tblPr>
@@ -6985,84 +6610,6 @@
               <w:jc w:val="left"/>
             </w:pPr>
             <w:r>
-              <w:t xml:space="preserve">Quick format instead of full format</w:t>
-            </w:r>
-          </w:p>
-        </w:tc>
-        <w:tc>
-          <w:p>
-            <w:pPr>
-              <w:pStyle w:val="Compact"/>
-              <w:jc w:val="left"/>
-            </w:pPr>
-            <w:r>
-              <w:t xml:space="preserve">Uncheck "Perform a quick format" (GUI) or use</w:t>
-            </w:r>
-            <w:r>
-              <w:t xml:space="preserve"> </w:t>
-            </w:r>
-            <w:r>
-              <w:rPr>
-                <w:rStyle w:val="VerbatimChar"/>
-              </w:rPr>
-              <w:t xml:space="preserve">-Full</w:t>
-            </w:r>
-            <w:r>
-              <w:t xml:space="preserve"> </w:t>
-            </w:r>
-            <w:r>
-              <w:t xml:space="preserve">(PowerShell)</w:t>
-            </w:r>
-          </w:p>
-        </w:tc>
-      </w:tr>
-      <w:tr>
-        <w:tc>
-          <w:p>
-            <w:pPr>
-              <w:pStyle w:val="Compact"/>
-              <w:jc w:val="left"/>
-            </w:pPr>
-            <w:r>
-              <w:t xml:space="preserve">Wrong volume label</w:t>
-            </w:r>
-          </w:p>
-        </w:tc>
-        <w:tc>
-          <w:p>
-            <w:pPr>
-              <w:pStyle w:val="Compact"/>
-              <w:jc w:val="left"/>
-            </w:pPr>
-            <w:r>
-              <w:t xml:space="preserve">It must be exactly</w:t>
-            </w:r>
-            <w:r>
-              <w:t xml:space="preserve"> </w:t>
-            </w:r>
-            <w:r>
-              <w:rPr>
-                <w:rStyle w:val="VerbatimChar"/>
-              </w:rPr>
-              <w:t xml:space="preserve">PXX-SANITIZED</w:t>
-            </w:r>
-            <w:r>
-              <w:t xml:space="preserve"> </w:t>
-            </w:r>
-            <w:r>
-              <w:t xml:space="preserve">with your own pod prefix</w:t>
-            </w:r>
-          </w:p>
-        </w:tc>
-      </w:tr>
-      <w:tr>
-        <w:tc>
-          <w:p>
-            <w:pPr>
-              <w:pStyle w:val="Compact"/>
-              <w:jc w:val="left"/>
-            </w:pPr>
-            <w:r>
               <w:t xml:space="preserve">Filling in only the sanitization log</w:t>
             </w:r>
           </w:p>
@@ -7148,12 +6695,6 @@
               </w:rPr>
               <w:t xml:space="preserve">Pass</w:t>
             </w:r>
-            <w:r>
-              <w:t xml:space="preserve"> </w:t>
-            </w:r>
-            <w:r>
-              <w:t xml:space="preserve">after you validate the media</w:t>
-            </w:r>
           </w:p>
         </w:tc>
       </w:tr>
@@ -7177,45 +6718,6 @@
             </w:pPr>
             <w:r>
               <w:t xml:space="preserve">The checker requires real explanatory text</w:t>
-            </w:r>
-          </w:p>
-        </w:tc>
-      </w:tr>
-      <w:tr>
-        <w:tc>
-          <w:p>
-            <w:pPr>
-              <w:pStyle w:val="Compact"/>
-              <w:jc w:val="left"/>
-            </w:pPr>
-            <w:r>
-              <w:t xml:space="preserve">Media left mounted</w:t>
-            </w:r>
-          </w:p>
-        </w:tc>
-        <w:tc>
-          <w:p>
-            <w:pPr>
-              <w:pStyle w:val="Compact"/>
-              <w:jc w:val="left"/>
-            </w:pPr>
-            <w:r>
-              <w:t xml:space="preserve">Eject the</w:t>
-            </w:r>
-            <w:r>
-              <w:t xml:space="preserve"> </w:t>
-            </w:r>
-            <w:r>
-              <w:rPr>
-                <w:rStyle w:val="VerbatimChar"/>
-              </w:rPr>
-              <w:t xml:space="preserve">.vhdx</w:t>
-            </w:r>
-            <w:r>
-              <w:t xml:space="preserve"> </w:t>
-            </w:r>
-            <w:r>
-              <w:t xml:space="preserve">before verification runs</w:t>
             </w:r>
           </w:p>
         </w:tc>
@@ -7248,7 +6750,7 @@
               <w:jc w:val="left"/>
             </w:pPr>
             <w:r>
-              <w:t xml:space="preserve">Leave it alone — it proves the volume was re-created</w:t>
+              <w:t xml:space="preserve">Leave it alone</w:t>
             </w:r>
           </w:p>
         </w:tc>
@@ -7296,19 +6798,7 @@
               <w:jc w:val="left"/>
             </w:pPr>
             <w:r>
-              <w:t xml:space="preserve">Turn on</w:t>
-            </w:r>
-            <w:r>
-              <w:t xml:space="preserve"> </w:t>
-            </w:r>
-            <w:r>
-              <w:rPr>
-                <w:b/>
-              </w:rPr>
-              <w:t xml:space="preserve">Hidden items</w:t>
-            </w:r>
-            <w:r>
-              <w:t xml:space="preserve">; check</w:t>
+              <w:t xml:space="preserve">The contents listing includes hidden items — read</w:t>
             </w:r>
             <w:r>
               <w:t xml:space="preserve"> </w:t>
@@ -7342,11 +6832,11 @@
       <w:pPr>
         <w:pStyle w:val="Heading3"/>
       </w:pPr>
-      <w:bookmarkStart w:id="63" w:name="getting-unstuck"/>
+      <w:bookmarkStart w:id="61" w:name="getting-unstuck"/>
       <w:r>
         <w:t xml:space="preserve">Getting Unstuck</w:t>
       </w:r>
-      <w:bookmarkEnd w:id="63"/>
+      <w:bookmarkEnd w:id="61"/>
     </w:p>
     <w:p>
       <w:pPr>
@@ -7360,40 +6850,47 @@
         <w:rPr>
           <w:b/>
         </w:rPr>
-        <w:t xml:space="preserve">Cannot mount the VHDX?</w:t>
-      </w:r>
-      <w:r>
-        <w:t xml:space="preserve"> </w:t>
-      </w:r>
-      <w:r>
-        <w:t xml:space="preserve">It may already be attached — check</w:t>
-      </w:r>
-      <w:r>
-        <w:t xml:space="preserve"> </w:t>
-      </w:r>
-      <w:r>
-        <w:rPr>
-          <w:b/>
-        </w:rPr>
-        <w:t xml:space="preserve">This PC</w:t>
-      </w:r>
-      <w:r>
-        <w:t xml:space="preserve">, or run</w:t>
-      </w:r>
-      <w:r>
-        <w:t xml:space="preserve"> </w:t>
-      </w:r>
-      <w:r>
-        <w:rPr>
-          <w:rStyle w:val="VerbatimChar"/>
-        </w:rPr>
-        <w:t xml:space="preserve">Dismount-DiskImage</w:t>
-      </w:r>
-      <w:r>
-        <w:t xml:space="preserve"> </w:t>
-      </w:r>
-      <w:r>
-        <w:t xml:space="preserve">and try again</w:t>
+        <w:t xml:space="preserve">Asked for administrator credentials when opening a</w:t>
+      </w:r>
+      <w:r>
+        <w:rPr>
+          <w:b/>
+        </w:rPr>
+        <w:t xml:space="preserve"> </w:t>
+      </w:r>
+      <w:r>
+        <w:rPr>
+          <w:rStyle w:val="VerbatimChar"/>
+          <w:b/>
+        </w:rPr>
+        <w:t xml:space="preserve">.vhdx</w:t>
+      </w:r>
+      <w:r>
+        <w:rPr>
+          <w:b/>
+        </w:rPr>
+        <w:t xml:space="preserve">?</w:t>
+      </w:r>
+      <w:r>
+        <w:t xml:space="preserve"> </w:t>
+      </w:r>
+      <w:r>
+        <w:t xml:space="preserve">Expected — cancel the prompt and read the</w:t>
+      </w:r>
+      <w:r>
+        <w:t xml:space="preserve"> </w:t>
+      </w:r>
+      <w:r>
+        <w:rPr>
+          <w:rStyle w:val="VerbatimChar"/>
+        </w:rPr>
+        <w:t xml:space="preserve">-Contents.txt</w:t>
+      </w:r>
+      <w:r>
+        <w:t xml:space="preserve"> </w:t>
+      </w:r>
+      <w:r>
+        <w:t xml:space="preserve">listing instead</w:t>
       </w:r>
     </w:p>
     <w:p>
@@ -7414,7 +6911,7 @@
         <w:t xml:space="preserve"> </w:t>
       </w:r>
       <w:r>
-        <w:t xml:space="preserve">Re-mount the media and check the label and that the volume is empty; then re-read the exact wording of the failure reason on your progress page</w:t>
+        <w:t xml:space="preserve">Re-read the exact wording of the failure reason on your progress page and check the answer CSVs against the tables above</w:t>
       </w:r>
     </w:p>
     <w:p>
@@ -7429,7 +6926,7 @@
         <w:rPr>
           <w:b/>
         </w:rPr>
-        <w:t xml:space="preserve">Broke the media?</w:t>
+        <w:t xml:space="preserve">Missing artifacts?</w:t>
       </w:r>
       <w:r>
         <w:t xml:space="preserve"> </w:t>
@@ -7449,11 +6946,11 @@
       <w:pPr>
         <w:pStyle w:val="Heading2"/>
       </w:pPr>
-      <w:bookmarkStart w:id="64" w:name="lab-completion-checklist"/>
+      <w:bookmarkStart w:id="62" w:name="lab-completion-checklist"/>
       <w:r>
         <w:t xml:space="preserve">Lab Completion Checklist</w:t>
       </w:r>
-      <w:bookmarkEnd w:id="64"/>
+      <w:bookmarkEnd w:id="62"/>
     </w:p>
     <w:tbl>
       <w:tblPr>
@@ -7673,18 +7170,6 @@
       </w:pPr>
       <w:r>
         <w:t xml:space="preserve">Confirm all seeded evidence files are still present</w:t>
-      </w:r>
-    </w:p>
-    <w:p>
-      <w:pPr>
-        <w:numPr>
-          <w:ilvl w:val="0"/>
-          <w:numId w:val="1036"/>
-        </w:numPr>
-        <w:pStyle w:val="Compact"/>
-      </w:pPr>
-      <w:r>
-        <w:t xml:space="preserve">Eject any mounted media</w:t>
       </w:r>
     </w:p>
     <w:p>
@@ -8317,6 +7802,9 @@
     <w:abstractNumId w:val="991"/>
   </w:num>
   <w:num w:numId="1014">
+    <w:abstractNumId w:val="991"/>
+  </w:num>
+  <w:num w:numId="1015">
     <w:abstractNumId w:val="99211"/>
     <w:lvlOverride w:ilvl="0">
       <w:startOverride w:val="1"/>
@@ -8345,9 +7833,6 @@
     <w:lvlOverride w:ilvl="8">
       <w:startOverride w:val="1"/>
     </w:lvlOverride>
-  </w:num>
-  <w:num w:numId="1015">
-    <w:abstractNumId w:val="991"/>
   </w:num>
   <w:num w:numId="1016">
     <w:abstractNumId w:val="991"/>
@@ -8365,6 +7850,9 @@
     <w:abstractNumId w:val="991"/>
   </w:num>
   <w:num w:numId="1021">
+    <w:abstractNumId w:val="991"/>
+  </w:num>
+  <w:num w:numId="1022">
     <w:abstractNumId w:val="99211"/>
     <w:lvlOverride w:ilvl="0">
       <w:startOverride w:val="1"/>
@@ -8393,9 +7881,6 @@
     <w:lvlOverride w:ilvl="8">
       <w:startOverride w:val="1"/>
     </w:lvlOverride>
-  </w:num>
-  <w:num w:numId="1022">
-    <w:abstractNumId w:val="991"/>
   </w:num>
   <w:num w:numId="1023">
     <w:abstractNumId w:val="991"/>

</xml_diff>

<commit_message>
docs(mp): state that media listings use the pod prefix, not literal PXX
</commit_message>
<xml_diff>
--- a/docs/MP-Lab-Completion-Guide.docx
+++ b/docs/MP-Lab-Completion-Guide.docx
@@ -1156,6 +1156,99 @@
       </w:r>
       <w:bookmarkEnd w:id="34"/>
     </w:p>
+    <w:p>
+      <w:pPr>
+        <w:pStyle w:val="BlockText"/>
+      </w:pPr>
+      <w:r>
+        <w:rPr>
+          <w:b/>
+        </w:rPr>
+        <w:t xml:space="preserve">File names use your own pod prefix, not</w:t>
+      </w:r>
+      <w:r>
+        <w:rPr>
+          <w:b/>
+        </w:rPr>
+        <w:t xml:space="preserve"> </w:t>
+      </w:r>
+      <w:r>
+        <w:rPr>
+          <w:rStyle w:val="VerbatimChar"/>
+          <w:b/>
+        </w:rPr>
+        <w:t xml:space="preserve">PXX</w:t>
+      </w:r>
+      <w:r>
+        <w:rPr>
+          <w:b/>
+        </w:rPr>
+        <w:t xml:space="preserve">.</w:t>
+      </w:r>
+      <w:r>
+        <w:t xml:space="preserve"> </w:t>
+      </w:r>
+      <w:r>
+        <w:rPr>
+          <w:rStyle w:val="VerbatimChar"/>
+        </w:rPr>
+        <w:t xml:space="preserve">PXX</w:t>
+      </w:r>
+      <w:r>
+        <w:t xml:space="preserve"> </w:t>
+      </w:r>
+      <w:r>
+        <w:t xml:space="preserve">is a placeholder for your</w:t>
+      </w:r>
+      <w:r>
+        <w:t xml:space="preserve"> </w:t>
+      </w:r>
+      <w:r>
+        <w:t xml:space="preserve">pod prefix throughout this guide: Pod 07 sees</w:t>
+      </w:r>
+      <w:r>
+        <w:t xml:space="preserve"> </w:t>
+      </w:r>
+      <w:r>
+        <w:rPr>
+          <w:rStyle w:val="VerbatimChar"/>
+        </w:rPr>
+        <w:t xml:space="preserve">P07-FCI-USB-Contents.txt</w:t>
+      </w:r>
+      <w:r>
+        <w:t xml:space="preserve">, Pod 03 sees</w:t>
+      </w:r>
+      <w:r>
+        <w:t xml:space="preserve"> </w:t>
+      </w:r>
+      <w:r>
+        <w:rPr>
+          <w:rStyle w:val="VerbatimChar"/>
+        </w:rPr>
+        <w:t xml:space="preserve">P03-FCI-USB-Contents.txt</w:t>
+      </w:r>
+      <w:r>
+        <w:t xml:space="preserve">. There is no file literally named</w:t>
+      </w:r>
+      <w:r>
+        <w:t xml:space="preserve"> </w:t>
+      </w:r>
+      <w:r>
+        <w:rPr>
+          <w:rStyle w:val="VerbatimChar"/>
+        </w:rPr>
+        <w:t xml:space="preserve">PXX-…</w:t>
+      </w:r>
+      <w:r>
+        <w:t xml:space="preserve">, so if a file in</w:t>
+      </w:r>
+      <w:r>
+        <w:t xml:space="preserve"> </w:t>
+      </w:r>
+      <w:r>
+        <w:t xml:space="preserve">the list below appears to be missing, look for the same name with your prefix.</w:t>
+      </w:r>
+    </w:p>
     <w:tbl>
       <w:tblPr>
         <w:tblStyle w:val="Table"/>
@@ -1318,7 +1411,19 @@
               <w:jc w:val="left"/>
             </w:pPr>
             <w:r>
-              <w:t xml:space="preserve">Full contents listing of each drive, including hidden items — read these instead of mounting</w:t>
+              <w:t xml:space="preserve">Full contents listing of each drive, including hidden items — read these instead of mounting (Pod 07:</w:t>
+            </w:r>
+            <w:r>
+              <w:t xml:space="preserve"> </w:t>
+            </w:r>
+            <w:r>
+              <w:rPr>
+                <w:rStyle w:val="VerbatimChar"/>
+              </w:rPr>
+              <w:t xml:space="preserve">P07-FCI-USB-Contents.txt</w:t>
+            </w:r>
+            <w:r>
+              <w:t xml:space="preserve">)</w:t>
             </w:r>
           </w:p>
         </w:tc>
@@ -2194,7 +2299,19 @@
         <w:pStyle w:val="Compact"/>
       </w:pPr>
       <w:r>
-        <w:t xml:space="preserve">Open the listing next to the drive image:</w:t>
+        <w:t xml:space="preserve">Open the listing next to the drive image (with your pod prefix in place of</w:t>
+      </w:r>
+      <w:r>
+        <w:t xml:space="preserve"> </w:t>
+      </w:r>
+      <w:r>
+        <w:rPr>
+          <w:rStyle w:val="VerbatimChar"/>
+        </w:rPr>
+        <w:t xml:space="preserve">PXX</w:t>
+      </w:r>
+      <w:r>
+        <w:t xml:space="preserve">):</w:t>
       </w:r>
     </w:p>
     <w:p>

</xml_diff>